<commit_message>
finalized resume page, redid main page, tweaked project page, added some project blogs
</commit_message>
<xml_diff>
--- a/auredia-man-script.docx
+++ b/auredia-man-script.docx
@@ -13,24 +13,14 @@
       </w:r>
     </w:p>
     <w:p>
-      <w:proofErr w:type="spellStart"/>
-      <w:r>
-        <w:t>Auredia</w:t>
-      </w:r>
-      <w:proofErr w:type="spellEnd"/>
-      <w:r>
-        <w:t xml:space="preserve"> Man</w:t>
-      </w:r>
-    </w:p>
-    <w:p>
-      <w:r>
-        <w:t xml:space="preserve">June 2026 | </w:t>
-      </w:r>
-      <w:proofErr w:type="spellStart"/>
-      <w:r>
-        <w:t>Auredia</w:t>
-      </w:r>
-      <w:proofErr w:type="spellEnd"/>
+      <w:r>
+        <w:t>Auredia Man</w:t>
+      </w:r>
+    </w:p>
+    <w:p>
+      <w:r>
+        <w:t>June 2026 | Auredia</w:t>
+      </w:r>
     </w:p>
     <w:p>
       <w:pPr>
@@ -51,47 +41,15 @@
         <w:jc w:val="center"/>
       </w:pPr>
       <w:r>
-        <w:t xml:space="preserve">Summer 2026 saw me intern for a startup named </w:t>
-      </w:r>
-      <w:proofErr w:type="spellStart"/>
-      <w:r>
-        <w:t>Auredia</w:t>
-      </w:r>
-      <w:proofErr w:type="spellEnd"/>
-      <w:r>
-        <w:t xml:space="preserve">. Their mascot is known as </w:t>
-      </w:r>
-      <w:proofErr w:type="spellStart"/>
-      <w:r>
-        <w:t>Auredia</w:t>
-      </w:r>
-      <w:proofErr w:type="spellEnd"/>
-      <w:r>
-        <w:t xml:space="preserve"> Man. An illustration for </w:t>
-      </w:r>
-      <w:proofErr w:type="spellStart"/>
-      <w:r>
-        <w:t>Auredia</w:t>
-      </w:r>
-      <w:proofErr w:type="spellEnd"/>
-      <w:r>
-        <w:t xml:space="preserve"> Man had already been made, a robotic mascot built out of a CNC machine. Several interns attempted in the past to create it as a 3D model, but all attempts were incomplete and lost to history. Thus, I accepted this as my first deep dive into Blender.</w:t>
-      </w:r>
-    </w:p>
-    <w:p>
-      <w:pPr>
-        <w:jc w:val="center"/>
-      </w:pPr>
-      <w:r>
-        <w:t>[</w:t>
-      </w:r>
-      <w:proofErr w:type="spellStart"/>
-      <w:r>
-        <w:t>auredia</w:t>
-      </w:r>
-      <w:proofErr w:type="spellEnd"/>
-      <w:r>
-        <w:t xml:space="preserve"> man reference image]</w:t>
+        <w:t>Summer 2026 saw me intern for a startup named Auredia. Their mascot is known as Auredia Man. An illustration for Auredia Man had already been made, a robotic mascot built out of a CNC machine. Several interns attempted in the past to create it as a 3D model, but all attempts were incomplete and lost to history. Thus, I accepted this as my first deep dive into Blender.</w:t>
+      </w:r>
+    </w:p>
+    <w:p>
+      <w:pPr>
+        <w:jc w:val="center"/>
+      </w:pPr>
+      <w:r>
+        <w:t>[auredia man reference image]</w:t>
       </w:r>
     </w:p>
     <w:p>
@@ -124,34 +82,10 @@
         <w:jc w:val="center"/>
       </w:pPr>
       <w:r>
-        <w:t xml:space="preserve">From here I struggled. I spent hours staring into the soul of the reference image – finding a way to begin this project. I tried to build the helmet, but I couldn’t create a non-destructive workflow. Over the next week, I spent several minutes per day making a failed attempt at a helmet for </w:t>
-      </w:r>
-      <w:proofErr w:type="spellStart"/>
-      <w:r>
-        <w:t>Auredia</w:t>
-      </w:r>
-      <w:proofErr w:type="spellEnd"/>
-      <w:r>
-        <w:t xml:space="preserve"> Man. Eventually, I pivoted to something I could rap my head around – a cube. I placed a cube down and began creating the torso of </w:t>
-      </w:r>
-      <w:proofErr w:type="spellStart"/>
-      <w:r>
-        <w:t>Auredia</w:t>
-      </w:r>
-      <w:proofErr w:type="spellEnd"/>
-      <w:r>
-        <w:t xml:space="preserve"> Man. From here, frustration at Blender turned into passion and drive. </w:t>
-      </w:r>
-      <w:r>
-        <w:t xml:space="preserve">By 6/24, a base CNC structure was created as </w:t>
-      </w:r>
-      <w:proofErr w:type="spellStart"/>
-      <w:r>
-        <w:t>Auredia</w:t>
-      </w:r>
-      <w:proofErr w:type="spellEnd"/>
-      <w:r>
-        <w:t xml:space="preserve"> Man’s upper torso.</w:t>
+        <w:t xml:space="preserve">From here I struggled. I spent hours staring into the soul of the reference image – finding a way to begin this project. I tried to build the helmet, but I couldn’t create a non-destructive workflow. Over the next week, I spent several minutes per day making a failed attempt at a helmet for Auredia Man. Eventually, I pivoted to something I could rap my head around – a cube. I placed a cube down and began creating the torso of Auredia Man. From here, frustration at Blender turned into passion and drive. </w:t>
+      </w:r>
+      <w:r>
+        <w:t>By 6/24, a base CNC structure was created as Auredia Man’s upper torso.</w:t>
       </w:r>
     </w:p>
     <w:p>
@@ -184,15 +118,7 @@
       </w:pPr>
       <w:r>
         <w:lastRenderedPageBreak/>
-        <w:t xml:space="preserve">Now, progress has become rapid. By 7/2, I finalized the helmet, face, neck. CNC monitoring racks, torso logo, lower torso, belt/buckle, and legs. By 7/06, the arms were added, and approval was given to 3D print a rough draft. After staring at the 3D printer for 2 hours, the very first </w:t>
-      </w:r>
-      <w:proofErr w:type="spellStart"/>
-      <w:r>
-        <w:t>Auredia</w:t>
-      </w:r>
-      <w:proofErr w:type="spellEnd"/>
-      <w:r>
-        <w:t xml:space="preserve"> Man was conceived </w:t>
+        <w:t xml:space="preserve">Now, progress has become rapid. By 7/2, I finalized the helmet, face, neck. CNC monitoring racks, torso logo, lower torso, belt/buckle, and legs. By 7/06, the arms were added, and approval was given to 3D print a rough draft. After staring at the 3D printer for 2 hours, the very first Auredia Man was conceived </w:t>
       </w:r>
       <w:r>
         <w:rPr>
@@ -209,15 +135,7 @@
         <w:jc w:val="center"/>
       </w:pPr>
       <w:r>
-        <w:t>[</w:t>
-      </w:r>
-      <w:proofErr w:type="spellStart"/>
-      <w:r>
-        <w:t>auredia</w:t>
-      </w:r>
-      <w:proofErr w:type="spellEnd"/>
-      <w:r>
-        <w:t>-man-blender]</w:t>
+        <w:t>[auredia-man-blender]</w:t>
       </w:r>
     </w:p>
     <w:p>
@@ -233,15 +151,7 @@
         <w:jc w:val="center"/>
       </w:pPr>
       <w:r>
-        <w:t xml:space="preserve">On 7/8, the final copy of </w:t>
-      </w:r>
-      <w:proofErr w:type="spellStart"/>
-      <w:r>
-        <w:t>Auredia</w:t>
-      </w:r>
-      <w:proofErr w:type="spellEnd"/>
-      <w:r>
-        <w:t xml:space="preserve"> Man needed to complete this project will be made. This one will use 5 filaments to generate a colorful recreation of the Blender copy.</w:t>
+        <w:t>On 7/8, the final copy of Auredia Man needed to complete this project will be made. This one will use 5 filaments to generate a colorful recreation of the Blender copy.</w:t>
       </w:r>
     </w:p>
     <w:p>
@@ -271,15 +181,261 @@
         </w:rPr>
       </w:pPr>
       <w:r>
+        <w:t>[auredia-cake]</w:t>
+      </w:r>
+    </w:p>
+    <w:p>
+      <w:pPr>
+        <w:jc w:val="center"/>
+      </w:pPr>
+      <w:r>
+        <w:t>[Return buttons]</w:t>
+      </w:r>
+    </w:p>
+    <w:p>
+      <w:r>
+        <w:br w:type="page"/>
+      </w:r>
+    </w:p>
+    <w:p>
+      <w:r>
+        <w:lastRenderedPageBreak/>
+        <w:t>&lt;- Back to Projects</w:t>
+      </w:r>
+    </w:p>
+    <w:p>
+      <w:r>
+        <w:t>Completed</w:t>
+      </w:r>
+      <w:r>
+        <w:t xml:space="preserve"> | </w:t>
+      </w:r>
+      <w:r>
+        <w:t xml:space="preserve">Hardware </w:t>
+      </w:r>
+      <w:r>
+        <w:t xml:space="preserve">| </w:t>
+      </w:r>
+      <w:r>
+        <w:t>KiCad</w:t>
+      </w:r>
+      <w:r>
+        <w:t xml:space="preserve"> | </w:t>
+      </w:r>
+      <w:r>
+        <w:t>PCB Design</w:t>
+      </w:r>
+    </w:p>
+    <w:p>
+      <w:r>
+        <w:t>Teensy Daughtercard</w:t>
+      </w:r>
+    </w:p>
+    <w:p>
+      <w:r>
+        <w:t xml:space="preserve">May 2026 - </w:t>
+      </w:r>
+      <w:r>
+        <w:t xml:space="preserve">June 2026 | </w:t>
+      </w:r>
+      <w:r>
+        <w:t>Texas A&amp;M Rocket Engine Design Avionics</w:t>
+      </w:r>
+    </w:p>
+    <w:p>
+      <w:pPr>
+        <w:jc w:val="center"/>
+      </w:pPr>
+      <w:r>
+        <w:t xml:space="preserve">Writing introductions to these projects is hard, so I will start off by reminiscing on the 2026 World Cup. One whole day without games is </w:t>
+      </w:r>
+      <w:r>
+        <w:t>**</w:t>
+      </w:r>
+      <w:r>
+        <w:t>STRAIGHT blasphemy</w:t>
+      </w:r>
+      <w:r>
+        <w:t>**</w:t>
+      </w:r>
+      <w:r>
+        <w:t xml:space="preserve">. </w:t>
+      </w:r>
+      <w:r>
+        <w:t>It’s</w:t>
+      </w:r>
+      <w:r>
+        <w:t xml:space="preserve"> ok</w:t>
+      </w:r>
+      <w:r>
+        <w:t>ay</w:t>
+      </w:r>
+      <w:r>
+        <w:t xml:space="preserve"> though</w:t>
+      </w:r>
+      <w:r>
+        <w:t xml:space="preserve"> because</w:t>
+      </w:r>
+      <w:r>
+        <w:t xml:space="preserve"> quarterfinals start tomorrow. </w:t>
+      </w:r>
+      <w:r>
+        <w:t xml:space="preserve">Anyways, like how the **GOAT Halland** can be seen with a cowboy hat during his stay in Texas, the Teensy </w:t>
+      </w:r>
+      <w:r>
+        <w:t>D</w:t>
+      </w:r>
+      <w:r>
+        <w:t>aughtercard is like a hat for the full avionic system here at Texas A&amp;M Rocket Engine Design</w:t>
+      </w:r>
+      <w:r>
+        <w:t xml:space="preserve"> (RED)</w:t>
+      </w:r>
+      <w:r>
+        <w:t xml:space="preserve">. </w:t>
+      </w:r>
+    </w:p>
+    <w:p>
+      <w:pPr>
+        <w:jc w:val="center"/>
+      </w:pPr>
+      <w:r>
+        <w:t>[picture Haaland-cowboy-hat]</w:t>
+      </w:r>
+    </w:p>
+    <w:p>
+      <w:pPr>
+        <w:jc w:val="center"/>
+      </w:pPr>
+      <w:r>
+        <w:t xml:space="preserve">The GigaPCB </w:t>
+      </w:r>
+      <w:r>
+        <w:t>interfaces with any RED rocket engine via stepper motor controllers, pressor transducers, and thermocouples. The Teensy Daughtercard is an attachment to the GigaPCB that provides Ethernet connectivity and computational capability. Separating these functions into a removable daughtercard allows controller designs to be modified, tested, and replaced without impacting the significantly more expensive sensor suite. Below is a conceptual block diagram of full avionic system.</w:t>
+      </w:r>
+    </w:p>
+    <w:p>
+      <w:pPr>
+        <w:jc w:val="center"/>
+      </w:pPr>
+      <w:r>
+        <w:t>[picture teensy-daughtercard-cbd]</w:t>
+      </w:r>
+    </w:p>
+    <w:p>
+      <w:pPr>
+        <w:jc w:val="center"/>
+      </w:pPr>
+      <w:r>
+        <w:t>Given GigaPCB pinouts, I was tasked with creating this complimentary daughtercard. I started off by finding a male complimentary that could mate with the GigaPCB, with the XG4A-5034 being suffice. I then bashed my head into a meat grinder visualizing how the daughtercard would connect to the GigaPCB. With a vague idea in mind, I referred to Teensy4.1 pinouts and mapped ~55 traces to the XG4A-5034. I also added an Ethernet connector, LED, and exposed several test points to create **THE GREATEST DAUGHTERCARD OF ALL TIME**.</w:t>
+      </w:r>
+    </w:p>
+    <w:p>
+      <w:pPr>
+        <w:jc w:val="center"/>
+        <w:rPr>
+          <w:rFonts w:ascii="Segoe UI Emoji" w:hAnsi="Segoe UI Emoji" w:cs="Segoe UI Emoji"/>
+        </w:rPr>
+      </w:pPr>
+      <w:r>
+        <w:t xml:space="preserve">Then I sent it to design review and redid the whole thing… </w:t>
+      </w:r>
+      <w:r>
+        <w:rPr>
+          <w:rFonts w:ascii="Segoe UI Emoji" w:hAnsi="Segoe UI Emoji" w:cs="Segoe UI Emoji"/>
+        </w:rPr>
+        <w:t>🗿</w:t>
+      </w:r>
+      <w:r>
+        <w:rPr>
+          <w:rFonts w:ascii="Segoe UI Emoji" w:hAnsi="Segoe UI Emoji" w:cs="Segoe UI Emoji"/>
+        </w:rPr>
+        <w:t>I attempted to create this using a 2-layer board which created a rat’s nest, especially given the various power planes. Here, I learned what a typical 4-layer board looks like:</w:t>
+      </w:r>
+    </w:p>
+    <w:p>
+      <w:pPr>
+        <w:pStyle w:val="ListParagraph"/>
+        <w:numPr>
+          <w:ilvl w:val="0"/>
+          <w:numId w:val="2"/>
+        </w:numPr>
+        <w:jc w:val="center"/>
+      </w:pPr>
+      <w:r>
+        <w:t>1. Signals Plane</w:t>
+      </w:r>
+    </w:p>
+    <w:p>
+      <w:pPr>
+        <w:pStyle w:val="ListParagraph"/>
+        <w:numPr>
+          <w:ilvl w:val="0"/>
+          <w:numId w:val="2"/>
+        </w:numPr>
+        <w:jc w:val="center"/>
+      </w:pPr>
+      <w:r>
+        <w:t>2. GND Plane</w:t>
+      </w:r>
+    </w:p>
+    <w:p>
+      <w:pPr>
+        <w:pStyle w:val="ListParagraph"/>
+        <w:numPr>
+          <w:ilvl w:val="0"/>
+          <w:numId w:val="2"/>
+        </w:numPr>
+        <w:jc w:val="center"/>
+      </w:pPr>
+      <w:r>
+        <w:t>3. Power Plane</w:t>
+      </w:r>
+    </w:p>
+    <w:p>
+      <w:pPr>
+        <w:pStyle w:val="ListParagraph"/>
+        <w:numPr>
+          <w:ilvl w:val="0"/>
+          <w:numId w:val="2"/>
+        </w:numPr>
+        <w:jc w:val="center"/>
+      </w:pPr>
+      <w:r>
+        <w:t>4. Signal Plane</w:t>
+      </w:r>
+    </w:p>
+    <w:p>
+      <w:pPr>
+        <w:pStyle w:val="ListParagraph"/>
+        <w:jc w:val="center"/>
+      </w:pPr>
+      <w:r>
+        <w:lastRenderedPageBreak/>
+        <w:t xml:space="preserve">Once remade, I received a final stamp of approval for the design. I created a Bill of Materials (BOM) with component specifications and a Standard Operating Procedure (SOP) for assembly/usage guidelines. Voila </w:t>
+      </w:r>
+      <w:r>
+        <w:rPr>
+          <w:rFonts w:ascii="Segoe UI Emoji" w:hAnsi="Segoe UI Emoji" w:cs="Segoe UI Emoji"/>
+        </w:rPr>
+        <w:t>😤</w:t>
+      </w:r>
+    </w:p>
+    <w:p>
+      <w:pPr>
+        <w:jc w:val="center"/>
+        <w:rPr>
+          <w:caps/>
+        </w:rPr>
+      </w:pPr>
+      <w:r>
         <w:t>[</w:t>
       </w:r>
-      <w:proofErr w:type="spellStart"/>
-      <w:r>
-        <w:t>auredia</w:t>
-      </w:r>
-      <w:proofErr w:type="spellEnd"/>
-      <w:r>
-        <w:t>-cake]</w:t>
+      <w:r>
+        <w:t>picture teensy-daughtercard</w:t>
+      </w:r>
+      <w:r>
+        <w:t>]</w:t>
       </w:r>
     </w:p>
     <w:p>
@@ -289,6 +445,11 @@
       <w:r>
         <w:t>[Return buttons]</w:t>
       </w:r>
+    </w:p>
+    <w:p>
+      <w:pPr>
+        <w:jc w:val="center"/>
+      </w:pPr>
     </w:p>
     <w:sectPr>
       <w:pgSz w:w="12240" w:h="15840"/>
@@ -298,6 +459,219 @@
     </w:sectPr>
   </w:body>
 </w:document>
+</file>
+
+<file path=word/numbering.xml><?xml version="1.0" encoding="utf-8"?>
+<w:numbering xmlns:wpc="http://schemas.microsoft.com/office/word/2010/wordprocessingCanvas" xmlns:cx="http://schemas.microsoft.com/office/drawing/2014/chartex" xmlns:cx1="http://schemas.microsoft.com/office/drawing/2015/9/8/chartex" xmlns:cx2="http://schemas.microsoft.com/office/drawing/2015/10/21/chartex" xmlns:cx3="http://schemas.microsoft.com/office/drawing/2016/5/9/chartex" xmlns:cx4="http://schemas.microsoft.com/office/drawing/2016/5/10/chartex" xmlns:cx5="http://schemas.microsoft.com/office/drawing/2016/5/11/chartex" xmlns:cx6="http://schemas.microsoft.com/office/drawing/2016/5/12/chartex" xmlns:cx7="http://schemas.microsoft.com/office/drawing/2016/5/13/chartex" xmlns:cx8="http://schemas.microsoft.com/office/drawing/2016/5/14/chartex" xmlns:mc="http://schemas.openxmlformats.org/markup-compatibility/2006" xmlns:aink="http://schemas.microsoft.com/office/drawing/2016/ink" xmlns:am3d="http://schemas.microsoft.com/office/drawing/2017/model3d" xmlns:o="urn:schemas-microsoft-com:office:office" xmlns:oel="http://schemas.microsoft.com/office/2019/extlst" xmlns:r="http://schemas.openxmlformats.org/officeDocument/2006/relationships" xmlns:m="http://schemas.openxmlformats.org/officeDocument/2006/math" xmlns:v="urn:schemas-microsoft-com:vml" xmlns:wp14="http://schemas.microsoft.com/office/word/2010/wordprocessingDrawing" xmlns:wp="http://schemas.openxmlformats.org/drawingml/2006/wordprocessingDrawing" xmlns:w10="urn:schemas-microsoft-com:office:word" xmlns:w="http://schemas.openxmlformats.org/wordprocessingml/2006/main" xmlns:w14="http://schemas.microsoft.com/office/word/2010/wordml" xmlns:w15="http://schemas.microsoft.com/office/word/2012/wordml" xmlns:w16cex="http://schemas.microsoft.com/office/word/2018/wordml/cex" xmlns:w16cid="http://schemas.microsoft.com/office/word/2016/wordml/cid" xmlns:w16="http://schemas.microsoft.com/office/word/2018/wordml" xmlns:w16du="http://schemas.microsoft.com/office/word/2023/wordml/word16du" xmlns:w16sdtdh="http://schemas.microsoft.com/office/word/2020/wordml/sdtdatahash" xmlns:w16sdtfl="http://schemas.microsoft.com/office/word/2024/wordml/sdtformatlock" xmlns:w16se="http://schemas.microsoft.com/office/word/2015/wordml/symex" xmlns:wpg="http://schemas.microsoft.com/office/word/2010/wordprocessingGroup" xmlns:wpi="http://schemas.microsoft.com/office/word/2010/wordprocessingInk" xmlns:wne="http://schemas.microsoft.com/office/word/2006/wordml" xmlns:wps="http://schemas.microsoft.com/office/word/2010/wordprocessingShape" mc:Ignorable="w14 w15 w16se w16cid w16 w16cex w16sdtdh w16sdtfl w16du wp14">
+  <w:abstractNum w:abstractNumId="0" w15:restartNumberingAfterBreak="0">
+    <w:nsid w:val="1FFC2B7C"/>
+    <w:multiLevelType w:val="hybridMultilevel"/>
+    <w:tmpl w:val="4280B14C"/>
+    <w:lvl w:ilvl="0" w:tplc="A2C61D74">
+      <w:start w:val="1"/>
+      <w:numFmt w:val="decimal"/>
+      <w:lvlText w:val="%1."/>
+      <w:lvlJc w:val="left"/>
+      <w:pPr>
+        <w:ind w:left="720" w:hanging="360"/>
+      </w:pPr>
+      <w:rPr>
+        <w:rFonts w:ascii="Segoe UI Emoji" w:hAnsi="Segoe UI Emoji" w:cs="Segoe UI Emoji" w:hint="default"/>
+      </w:rPr>
+    </w:lvl>
+    <w:lvl w:ilvl="1" w:tplc="04090019" w:tentative="1">
+      <w:start w:val="1"/>
+      <w:numFmt w:val="lowerLetter"/>
+      <w:lvlText w:val="%2."/>
+      <w:lvlJc w:val="left"/>
+      <w:pPr>
+        <w:ind w:left="1440" w:hanging="360"/>
+      </w:pPr>
+    </w:lvl>
+    <w:lvl w:ilvl="2" w:tplc="0409001B" w:tentative="1">
+      <w:start w:val="1"/>
+      <w:numFmt w:val="lowerRoman"/>
+      <w:lvlText w:val="%3."/>
+      <w:lvlJc w:val="right"/>
+      <w:pPr>
+        <w:ind w:left="2160" w:hanging="180"/>
+      </w:pPr>
+    </w:lvl>
+    <w:lvl w:ilvl="3" w:tplc="0409000F" w:tentative="1">
+      <w:start w:val="1"/>
+      <w:numFmt w:val="decimal"/>
+      <w:lvlText w:val="%4."/>
+      <w:lvlJc w:val="left"/>
+      <w:pPr>
+        <w:ind w:left="2880" w:hanging="360"/>
+      </w:pPr>
+    </w:lvl>
+    <w:lvl w:ilvl="4" w:tplc="04090019" w:tentative="1">
+      <w:start w:val="1"/>
+      <w:numFmt w:val="lowerLetter"/>
+      <w:lvlText w:val="%5."/>
+      <w:lvlJc w:val="left"/>
+      <w:pPr>
+        <w:ind w:left="3600" w:hanging="360"/>
+      </w:pPr>
+    </w:lvl>
+    <w:lvl w:ilvl="5" w:tplc="0409001B" w:tentative="1">
+      <w:start w:val="1"/>
+      <w:numFmt w:val="lowerRoman"/>
+      <w:lvlText w:val="%6."/>
+      <w:lvlJc w:val="right"/>
+      <w:pPr>
+        <w:ind w:left="4320" w:hanging="180"/>
+      </w:pPr>
+    </w:lvl>
+    <w:lvl w:ilvl="6" w:tplc="0409000F" w:tentative="1">
+      <w:start w:val="1"/>
+      <w:numFmt w:val="decimal"/>
+      <w:lvlText w:val="%7."/>
+      <w:lvlJc w:val="left"/>
+      <w:pPr>
+        <w:ind w:left="5040" w:hanging="360"/>
+      </w:pPr>
+    </w:lvl>
+    <w:lvl w:ilvl="7" w:tplc="04090019" w:tentative="1">
+      <w:start w:val="1"/>
+      <w:numFmt w:val="lowerLetter"/>
+      <w:lvlText w:val="%8."/>
+      <w:lvlJc w:val="left"/>
+      <w:pPr>
+        <w:ind w:left="5760" w:hanging="360"/>
+      </w:pPr>
+    </w:lvl>
+    <w:lvl w:ilvl="8" w:tplc="0409001B" w:tentative="1">
+      <w:start w:val="1"/>
+      <w:numFmt w:val="lowerRoman"/>
+      <w:lvlText w:val="%9."/>
+      <w:lvlJc w:val="right"/>
+      <w:pPr>
+        <w:ind w:left="6480" w:hanging="180"/>
+      </w:pPr>
+    </w:lvl>
+  </w:abstractNum>
+  <w:abstractNum w:abstractNumId="1" w15:restartNumberingAfterBreak="0">
+    <w:nsid w:val="3C873F32"/>
+    <w:multiLevelType w:val="hybridMultilevel"/>
+    <w:tmpl w:val="3C9C9D20"/>
+    <w:lvl w:ilvl="0" w:tplc="E968BEDA">
+      <w:start w:val="1"/>
+      <w:numFmt w:val="bullet"/>
+      <w:lvlText w:val=""/>
+      <w:lvlJc w:val="left"/>
+      <w:pPr>
+        <w:ind w:left="720" w:hanging="360"/>
+      </w:pPr>
+      <w:rPr>
+        <w:rFonts w:ascii="Wingdings" w:eastAsiaTheme="minorHAnsi" w:hAnsi="Wingdings" w:cstheme="minorBidi" w:hint="default"/>
+      </w:rPr>
+    </w:lvl>
+    <w:lvl w:ilvl="1" w:tplc="04090003" w:tentative="1">
+      <w:start w:val="1"/>
+      <w:numFmt w:val="bullet"/>
+      <w:lvlText w:val="o"/>
+      <w:lvlJc w:val="left"/>
+      <w:pPr>
+        <w:ind w:left="1440" w:hanging="360"/>
+      </w:pPr>
+      <w:rPr>
+        <w:rFonts w:ascii="Courier New" w:hAnsi="Courier New" w:cs="Courier New" w:hint="default"/>
+      </w:rPr>
+    </w:lvl>
+    <w:lvl w:ilvl="2" w:tplc="04090005" w:tentative="1">
+      <w:start w:val="1"/>
+      <w:numFmt w:val="bullet"/>
+      <w:lvlText w:val=""/>
+      <w:lvlJc w:val="left"/>
+      <w:pPr>
+        <w:ind w:left="2160" w:hanging="360"/>
+      </w:pPr>
+      <w:rPr>
+        <w:rFonts w:ascii="Wingdings" w:hAnsi="Wingdings" w:hint="default"/>
+      </w:rPr>
+    </w:lvl>
+    <w:lvl w:ilvl="3" w:tplc="04090001" w:tentative="1">
+      <w:start w:val="1"/>
+      <w:numFmt w:val="bullet"/>
+      <w:lvlText w:val=""/>
+      <w:lvlJc w:val="left"/>
+      <w:pPr>
+        <w:ind w:left="2880" w:hanging="360"/>
+      </w:pPr>
+      <w:rPr>
+        <w:rFonts w:ascii="Symbol" w:hAnsi="Symbol" w:hint="default"/>
+      </w:rPr>
+    </w:lvl>
+    <w:lvl w:ilvl="4" w:tplc="04090003" w:tentative="1">
+      <w:start w:val="1"/>
+      <w:numFmt w:val="bullet"/>
+      <w:lvlText w:val="o"/>
+      <w:lvlJc w:val="left"/>
+      <w:pPr>
+        <w:ind w:left="3600" w:hanging="360"/>
+      </w:pPr>
+      <w:rPr>
+        <w:rFonts w:ascii="Courier New" w:hAnsi="Courier New" w:cs="Courier New" w:hint="default"/>
+      </w:rPr>
+    </w:lvl>
+    <w:lvl w:ilvl="5" w:tplc="04090005" w:tentative="1">
+      <w:start w:val="1"/>
+      <w:numFmt w:val="bullet"/>
+      <w:lvlText w:val=""/>
+      <w:lvlJc w:val="left"/>
+      <w:pPr>
+        <w:ind w:left="4320" w:hanging="360"/>
+      </w:pPr>
+      <w:rPr>
+        <w:rFonts w:ascii="Wingdings" w:hAnsi="Wingdings" w:hint="default"/>
+      </w:rPr>
+    </w:lvl>
+    <w:lvl w:ilvl="6" w:tplc="04090001" w:tentative="1">
+      <w:start w:val="1"/>
+      <w:numFmt w:val="bullet"/>
+      <w:lvlText w:val=""/>
+      <w:lvlJc w:val="left"/>
+      <w:pPr>
+        <w:ind w:left="5040" w:hanging="360"/>
+      </w:pPr>
+      <w:rPr>
+        <w:rFonts w:ascii="Symbol" w:hAnsi="Symbol" w:hint="default"/>
+      </w:rPr>
+    </w:lvl>
+    <w:lvl w:ilvl="7" w:tplc="04090003" w:tentative="1">
+      <w:start w:val="1"/>
+      <w:numFmt w:val="bullet"/>
+      <w:lvlText w:val="o"/>
+      <w:lvlJc w:val="left"/>
+      <w:pPr>
+        <w:ind w:left="5760" w:hanging="360"/>
+      </w:pPr>
+      <w:rPr>
+        <w:rFonts w:ascii="Courier New" w:hAnsi="Courier New" w:cs="Courier New" w:hint="default"/>
+      </w:rPr>
+    </w:lvl>
+    <w:lvl w:ilvl="8" w:tplc="04090005" w:tentative="1">
+      <w:start w:val="1"/>
+      <w:numFmt w:val="bullet"/>
+      <w:lvlText w:val=""/>
+      <w:lvlJc w:val="left"/>
+      <w:pPr>
+        <w:ind w:left="6480" w:hanging="360"/>
+      </w:pPr>
+      <w:rPr>
+        <w:rFonts w:ascii="Wingdings" w:hAnsi="Wingdings" w:hint="default"/>
+      </w:rPr>
+    </w:lvl>
+  </w:abstractNum>
+  <w:num w:numId="1" w16cid:durableId="1130318727">
+    <w:abstractNumId w:val="0"/>
+  </w:num>
+  <w:num w:numId="2" w16cid:durableId="133332132">
+    <w:abstractNumId w:val="1"/>
+  </w:num>
+</w:numbering>
 </file>
 
 <file path=word/styles.xml><?xml version="1.0" encoding="utf-8"?>

</xml_diff>

<commit_message>
Added current testboards page
</commit_message>
<xml_diff>
--- a/auredia-man-script.docx
+++ b/auredia-man-script.docx
@@ -13,14 +13,24 @@
       </w:r>
     </w:p>
     <w:p>
-      <w:r>
-        <w:t>Auredia Man</w:t>
-      </w:r>
-    </w:p>
-    <w:p>
-      <w:r>
-        <w:t>June 2026 | Auredia</w:t>
-      </w:r>
+      <w:proofErr w:type="spellStart"/>
+      <w:r>
+        <w:t>Auredia</w:t>
+      </w:r>
+      <w:proofErr w:type="spellEnd"/>
+      <w:r>
+        <w:t xml:space="preserve"> Man</w:t>
+      </w:r>
+    </w:p>
+    <w:p>
+      <w:r>
+        <w:t xml:space="preserve">June 2026 | </w:t>
+      </w:r>
+      <w:proofErr w:type="spellStart"/>
+      <w:r>
+        <w:t>Auredia</w:t>
+      </w:r>
+      <w:proofErr w:type="spellEnd"/>
     </w:p>
     <w:p>
       <w:pPr>
@@ -41,15 +51,47 @@
         <w:jc w:val="center"/>
       </w:pPr>
       <w:r>
-        <w:t>Summer 2026 saw me intern for a startup named Auredia. Their mascot is known as Auredia Man. An illustration for Auredia Man had already been made, a robotic mascot built out of a CNC machine. Several interns attempted in the past to create it as a 3D model, but all attempts were incomplete and lost to history. Thus, I accepted this as my first deep dive into Blender.</w:t>
-      </w:r>
-    </w:p>
-    <w:p>
-      <w:pPr>
-        <w:jc w:val="center"/>
-      </w:pPr>
-      <w:r>
-        <w:t>[auredia man reference image]</w:t>
+        <w:t xml:space="preserve">Summer 2026 saw me intern for a startup named </w:t>
+      </w:r>
+      <w:proofErr w:type="spellStart"/>
+      <w:r>
+        <w:t>Auredia</w:t>
+      </w:r>
+      <w:proofErr w:type="spellEnd"/>
+      <w:r>
+        <w:t xml:space="preserve">. Their mascot is known as </w:t>
+      </w:r>
+      <w:proofErr w:type="spellStart"/>
+      <w:r>
+        <w:t>Auredia</w:t>
+      </w:r>
+      <w:proofErr w:type="spellEnd"/>
+      <w:r>
+        <w:t xml:space="preserve"> Man. An illustration for </w:t>
+      </w:r>
+      <w:proofErr w:type="spellStart"/>
+      <w:r>
+        <w:t>Auredia</w:t>
+      </w:r>
+      <w:proofErr w:type="spellEnd"/>
+      <w:r>
+        <w:t xml:space="preserve"> Man had already been made, a robotic mascot built out of a CNC machine. Several interns attempted in the past to create it as a 3D model, but all attempts were incomplete and lost to history. Thus, I accepted this as my first deep dive into Blender.</w:t>
+      </w:r>
+    </w:p>
+    <w:p>
+      <w:pPr>
+        <w:jc w:val="center"/>
+      </w:pPr>
+      <w:r>
+        <w:t>[</w:t>
+      </w:r>
+      <w:proofErr w:type="spellStart"/>
+      <w:r>
+        <w:t>auredia</w:t>
+      </w:r>
+      <w:proofErr w:type="spellEnd"/>
+      <w:r>
+        <w:t xml:space="preserve"> man reference image]</w:t>
       </w:r>
     </w:p>
     <w:p>
@@ -82,10 +124,34 @@
         <w:jc w:val="center"/>
       </w:pPr>
       <w:r>
-        <w:t xml:space="preserve">From here I struggled. I spent hours staring into the soul of the reference image – finding a way to begin this project. I tried to build the helmet, but I couldn’t create a non-destructive workflow. Over the next week, I spent several minutes per day making a failed attempt at a helmet for Auredia Man. Eventually, I pivoted to something I could rap my head around – a cube. I placed a cube down and began creating the torso of Auredia Man. From here, frustration at Blender turned into passion and drive. </w:t>
-      </w:r>
-      <w:r>
-        <w:t>By 6/24, a base CNC structure was created as Auredia Man’s upper torso.</w:t>
+        <w:t xml:space="preserve">From here I struggled. I spent hours staring into the soul of the reference image – finding a way to begin this project. I tried to build the helmet, but I couldn’t create a non-destructive workflow. Over the next week, I spent several minutes per day making a failed attempt at a helmet for </w:t>
+      </w:r>
+      <w:proofErr w:type="spellStart"/>
+      <w:r>
+        <w:t>Auredia</w:t>
+      </w:r>
+      <w:proofErr w:type="spellEnd"/>
+      <w:r>
+        <w:t xml:space="preserve"> Man. Eventually, I pivoted to something I could rap my head around – a cube. I placed a cube down and began creating the torso of </w:t>
+      </w:r>
+      <w:proofErr w:type="spellStart"/>
+      <w:r>
+        <w:t>Auredia</w:t>
+      </w:r>
+      <w:proofErr w:type="spellEnd"/>
+      <w:r>
+        <w:t xml:space="preserve"> Man. From here, frustration at Blender turned into passion and drive. </w:t>
+      </w:r>
+      <w:r>
+        <w:t xml:space="preserve">By 6/24, a base CNC structure was created as </w:t>
+      </w:r>
+      <w:proofErr w:type="spellStart"/>
+      <w:r>
+        <w:t>Auredia</w:t>
+      </w:r>
+      <w:proofErr w:type="spellEnd"/>
+      <w:r>
+        <w:t xml:space="preserve"> Man’s upper torso.</w:t>
       </w:r>
     </w:p>
     <w:p>
@@ -118,7 +184,15 @@
       </w:pPr>
       <w:r>
         <w:lastRenderedPageBreak/>
-        <w:t xml:space="preserve">Now, progress has become rapid. By 7/2, I finalized the helmet, face, neck. CNC monitoring racks, torso logo, lower torso, belt/buckle, and legs. By 7/06, the arms were added, and approval was given to 3D print a rough draft. After staring at the 3D printer for 2 hours, the very first Auredia Man was conceived </w:t>
+        <w:t xml:space="preserve">Now, progress has become rapid. By 7/2, I finalized the helmet, face, neck. CNC monitoring racks, torso logo, lower torso, belt/buckle, and legs. By 7/06, the arms were added, and approval was given to 3D print a rough draft. After staring at the 3D printer for 2 hours, the very first </w:t>
+      </w:r>
+      <w:proofErr w:type="spellStart"/>
+      <w:r>
+        <w:t>Auredia</w:t>
+      </w:r>
+      <w:proofErr w:type="spellEnd"/>
+      <w:r>
+        <w:t xml:space="preserve"> Man was conceived </w:t>
       </w:r>
       <w:r>
         <w:rPr>
@@ -135,7 +209,15 @@
         <w:jc w:val="center"/>
       </w:pPr>
       <w:r>
-        <w:t>[auredia-man-blender]</w:t>
+        <w:t>[</w:t>
+      </w:r>
+      <w:proofErr w:type="spellStart"/>
+      <w:r>
+        <w:t>auredia</w:t>
+      </w:r>
+      <w:proofErr w:type="spellEnd"/>
+      <w:r>
+        <w:t>-man-blender]</w:t>
       </w:r>
     </w:p>
     <w:p>
@@ -151,7 +233,15 @@
         <w:jc w:val="center"/>
       </w:pPr>
       <w:r>
-        <w:t>On 7/8, the final copy of Auredia Man needed to complete this project will be made. This one will use 5 filaments to generate a colorful recreation of the Blender copy.</w:t>
+        <w:t xml:space="preserve">On 7/8, the final copy of </w:t>
+      </w:r>
+      <w:proofErr w:type="spellStart"/>
+      <w:r>
+        <w:t>Auredia</w:t>
+      </w:r>
+      <w:proofErr w:type="spellEnd"/>
+      <w:r>
+        <w:t xml:space="preserve"> Man needed to complete this project will be made. This one will use 5 filaments to generate a colorful recreation of the Blender copy.</w:t>
       </w:r>
     </w:p>
     <w:p>
@@ -181,7 +271,15 @@
         </w:rPr>
       </w:pPr>
       <w:r>
-        <w:t>[auredia-cake]</w:t>
+        <w:t>[</w:t>
+      </w:r>
+      <w:proofErr w:type="spellStart"/>
+      <w:r>
+        <w:t>auredia</w:t>
+      </w:r>
+      <w:proofErr w:type="spellEnd"/>
+      <w:r>
+        <w:t>-cake]</w:t>
       </w:r>
     </w:p>
     <w:p>
@@ -205,152 +303,196 @@
     </w:p>
     <w:p>
       <w:r>
-        <w:t>Completed</w:t>
-      </w:r>
-      <w:r>
-        <w:t xml:space="preserve"> | </w:t>
-      </w:r>
-      <w:r>
-        <w:t xml:space="preserve">Hardware </w:t>
-      </w:r>
-      <w:r>
-        <w:t xml:space="preserve">| </w:t>
-      </w:r>
-      <w:r>
-        <w:t>KiCad</w:t>
-      </w:r>
-      <w:r>
-        <w:t xml:space="preserve"> | </w:t>
-      </w:r>
-      <w:r>
-        <w:t>PCB Design</w:t>
-      </w:r>
-    </w:p>
-    <w:p>
-      <w:r>
-        <w:t>Teensy Daughtercard</w:t>
-      </w:r>
-    </w:p>
-    <w:p>
-      <w:r>
-        <w:t xml:space="preserve">May 2026 - </w:t>
-      </w:r>
-      <w:r>
-        <w:t xml:space="preserve">June 2026 | </w:t>
-      </w:r>
-      <w:r>
-        <w:t>Texas A&amp;M Rocket Engine Design Avionics</w:t>
-      </w:r>
-    </w:p>
-    <w:p>
-      <w:pPr>
-        <w:jc w:val="center"/>
-      </w:pPr>
-      <w:r>
-        <w:t xml:space="preserve">Writing introductions to these projects is hard, so I will start off by reminiscing on the 2026 World Cup. One whole day without games is </w:t>
-      </w:r>
-      <w:r>
-        <w:t>**</w:t>
-      </w:r>
-      <w:r>
-        <w:t>STRAIGHT blasphemy</w:t>
-      </w:r>
-      <w:r>
-        <w:t>**</w:t>
-      </w:r>
-      <w:r>
-        <w:t xml:space="preserve">. </w:t>
-      </w:r>
-      <w:r>
-        <w:t>It’s</w:t>
-      </w:r>
-      <w:r>
-        <w:t xml:space="preserve"> ok</w:t>
-      </w:r>
-      <w:r>
-        <w:t>ay</w:t>
-      </w:r>
-      <w:r>
-        <w:t xml:space="preserve"> though</w:t>
-      </w:r>
-      <w:r>
-        <w:t xml:space="preserve"> because</w:t>
-      </w:r>
-      <w:r>
-        <w:t xml:space="preserve"> quarterfinals start tomorrow. </w:t>
-      </w:r>
-      <w:r>
-        <w:t xml:space="preserve">Anyways, like how the **GOAT Halland** can be seen with a cowboy hat during his stay in Texas, the Teensy </w:t>
-      </w:r>
-      <w:r>
-        <w:t>D</w:t>
-      </w:r>
-      <w:r>
-        <w:t>aughtercard is like a hat for the full avionic system here at Texas A&amp;M Rocket Engine Design</w:t>
-      </w:r>
-      <w:r>
-        <w:t xml:space="preserve"> (RED)</w:t>
-      </w:r>
-      <w:r>
-        <w:t xml:space="preserve">. </w:t>
-      </w:r>
-    </w:p>
-    <w:p>
-      <w:pPr>
-        <w:jc w:val="center"/>
-      </w:pPr>
-      <w:r>
-        <w:t>[picture Haaland-cowboy-hat]</w:t>
-      </w:r>
-    </w:p>
-    <w:p>
-      <w:pPr>
-        <w:jc w:val="center"/>
-      </w:pPr>
-      <w:r>
-        <w:t xml:space="preserve">The GigaPCB </w:t>
-      </w:r>
-      <w:r>
-        <w:t>interfaces with any RED rocket engine via stepper motor controllers, pressor transducers, and thermocouples. The Teensy Daughtercard is an attachment to the GigaPCB that provides Ethernet connectivity and computational capability. Separating these functions into a removable daughtercard allows controller designs to be modified, tested, and replaced without impacting the significantly more expensive sensor suite. Below is a conceptual block diagram of full avionic system.</w:t>
-      </w:r>
-    </w:p>
-    <w:p>
-      <w:pPr>
-        <w:jc w:val="center"/>
-      </w:pPr>
-      <w:r>
-        <w:t>[picture teensy-daughtercard-cbd]</w:t>
-      </w:r>
-    </w:p>
-    <w:p>
-      <w:pPr>
-        <w:jc w:val="center"/>
-      </w:pPr>
-      <w:r>
-        <w:t>Given GigaPCB pinouts, I was tasked with creating this complimentary daughtercard. I started off by finding a male complimentary that could mate with the GigaPCB, with the XG4A-5034 being suffice. I then bashed my head into a meat grinder visualizing how the daughtercard would connect to the GigaPCB. With a vague idea in mind, I referred to Teensy4.1 pinouts and mapped ~55 traces to the XG4A-5034. I also added an Ethernet connector, LED, and exposed several test points to create **THE GREATEST DAUGHTERCARD OF ALL TIME**.</w:t>
-      </w:r>
-    </w:p>
-    <w:p>
-      <w:pPr>
-        <w:jc w:val="center"/>
         <w:rPr>
           <w:rFonts w:ascii="Segoe UI Emoji" w:hAnsi="Segoe UI Emoji" w:cs="Segoe UI Emoji"/>
+          <w:b/>
+          <w:bCs/>
         </w:rPr>
-      </w:pPr>
-      <w:r>
-        <w:t xml:space="preserve">Then I sent it to design review and redid the whole thing… </w:t>
+        <w:t>✨</w:t>
       </w:r>
       <w:r>
         <w:rPr>
-          <w:rFonts w:ascii="Segoe UI Emoji" w:hAnsi="Segoe UI Emoji" w:cs="Segoe UI Emoji"/>
+          <w:b/>
+          <w:bCs/>
         </w:rPr>
-        <w:t>🗿</w:t>
-      </w:r>
-      <w:r>
-        <w:rPr>
-          <w:rFonts w:ascii="Segoe UI Emoji" w:hAnsi="Segoe UI Emoji" w:cs="Segoe UI Emoji"/>
-        </w:rPr>
-        <w:t>I attempted to create this using a 2-layer board which created a rat’s nest, especially given the various power planes. Here, I learned what a typical 4-layer board looks like:</w:t>
+        <w:t xml:space="preserve"> </w:t>
+      </w:r>
+      <w:r>
+        <w:t>Completed</w:t>
+      </w:r>
+      <w:r>
+        <w:t xml:space="preserve"> | </w:t>
+      </w:r>
+      <w:r>
+        <w:t xml:space="preserve">Hardware </w:t>
+      </w:r>
+      <w:r>
+        <w:t xml:space="preserve">| </w:t>
+      </w:r>
+      <w:proofErr w:type="spellStart"/>
+      <w:r>
+        <w:t>KiCad</w:t>
+      </w:r>
+      <w:proofErr w:type="spellEnd"/>
+      <w:r>
+        <w:t xml:space="preserve"> | </w:t>
+      </w:r>
+      <w:r>
+        <w:t>PCB Design</w:t>
+      </w:r>
+    </w:p>
+    <w:p>
+      <w:r>
+        <w:t>Teensy Daughtercard</w:t>
+      </w:r>
+    </w:p>
+    <w:p>
+      <w:r>
+        <w:t xml:space="preserve">May 2026 - </w:t>
+      </w:r>
+      <w:r>
+        <w:t xml:space="preserve">June 2026 | </w:t>
+      </w:r>
+      <w:r>
+        <w:t>Texas A&amp;M Rocket Engine Design Avionics</w:t>
+      </w:r>
+    </w:p>
+    <w:p>
+      <w:pPr>
+        <w:jc w:val="center"/>
+      </w:pPr>
+      <w:r>
+        <w:t>Subtitle “Context:”</w:t>
+      </w:r>
+    </w:p>
+    <w:p>
+      <w:pPr>
+        <w:jc w:val="center"/>
+      </w:pPr>
+      <w:r>
+        <w:t xml:space="preserve">The </w:t>
+      </w:r>
+      <w:proofErr w:type="spellStart"/>
+      <w:r>
+        <w:t>GigaPCB</w:t>
+      </w:r>
+      <w:proofErr w:type="spellEnd"/>
+      <w:r>
+        <w:t xml:space="preserve"> </w:t>
+      </w:r>
+      <w:r>
+        <w:t>interfaces with any RED rocket engine</w:t>
+      </w:r>
+      <w:r>
+        <w:t>’s electrical systems</w:t>
+      </w:r>
+      <w:r>
+        <w:t xml:space="preserve"> via stepper motor controllers, </w:t>
+      </w:r>
+      <w:r>
+        <w:t>pressure</w:t>
+      </w:r>
+      <w:r>
+        <w:t xml:space="preserve"> transducers, and thermocouples. The Teensy Daughtercard is an attachment to the </w:t>
+      </w:r>
+      <w:proofErr w:type="spellStart"/>
+      <w:r>
+        <w:t>GigaPCB</w:t>
+      </w:r>
+      <w:proofErr w:type="spellEnd"/>
+      <w:r>
+        <w:t xml:space="preserve"> that provides Ethernet connectivity and computational capability. Separating these functions into a removable daughtercard allows controller designs to be modified, tested, and replaced without impacting the significantly more expensive sensor suite. Below is a conceptual block diagram of full avionic system.</w:t>
+      </w:r>
+    </w:p>
+    <w:p>
+      <w:pPr>
+        <w:jc w:val="center"/>
+      </w:pPr>
+      <w:r>
+        <w:t>[picture teensy-daughtercard-</w:t>
+      </w:r>
+      <w:proofErr w:type="spellStart"/>
+      <w:r>
+        <w:t>cbd</w:t>
+      </w:r>
+      <w:proofErr w:type="spellEnd"/>
+      <w:r>
+        <w:t>]</w:t>
+      </w:r>
+    </w:p>
+    <w:p>
+      <w:pPr>
+        <w:jc w:val="center"/>
+      </w:pPr>
+      <w:r>
+        <w:t>Subtitle “Procedure:”</w:t>
+      </w:r>
+    </w:p>
+    <w:p>
+      <w:pPr>
+        <w:jc w:val="center"/>
+      </w:pPr>
+      <w:r>
+        <w:t xml:space="preserve">Given </w:t>
+      </w:r>
+      <w:proofErr w:type="spellStart"/>
+      <w:r>
+        <w:t>GigaPCB</w:t>
+      </w:r>
+      <w:proofErr w:type="spellEnd"/>
+      <w:r>
+        <w:t xml:space="preserve"> pinouts, I was tasked with creating this complimentary daughtercard. I started off by finding a male complimentary that could mate with the </w:t>
+      </w:r>
+      <w:proofErr w:type="spellStart"/>
+      <w:r>
+        <w:t>GigaPCB</w:t>
+      </w:r>
+      <w:proofErr w:type="spellEnd"/>
+      <w:r>
+        <w:t xml:space="preserve">, with the XG4A-5034 being suffice. I then bashed my head into a meat grinder visualizing how the daughtercard would connect to the </w:t>
+      </w:r>
+      <w:proofErr w:type="spellStart"/>
+      <w:r>
+        <w:t>GigaPCB</w:t>
+      </w:r>
+      <w:proofErr w:type="spellEnd"/>
+      <w:r>
+        <w:t xml:space="preserve">. With a vague idea in mind, I referred to Teensy4.1 pinouts and mapped ~55 traces to the XG4A-5034. I also added an Ethernet connector, LED, and exposed several test points </w:t>
+      </w:r>
+      <w:r>
+        <w:t>to finish the design.</w:t>
+      </w:r>
+    </w:p>
+    <w:p>
+      <w:pPr>
+        <w:jc w:val="center"/>
+      </w:pPr>
+      <w:r>
+        <w:t xml:space="preserve">[loaded up version of teensy </w:t>
+      </w:r>
+      <w:proofErr w:type="spellStart"/>
+      <w:r>
+        <w:t>stl</w:t>
+      </w:r>
+      <w:proofErr w:type="spellEnd"/>
+      <w:r>
+        <w:t>]</w:t>
+      </w:r>
+    </w:p>
+    <w:p>
+      <w:pPr>
+        <w:jc w:val="center"/>
+      </w:pPr>
+      <w:r>
+        <w:t>Subtitle “What was Learned:”</w:t>
+      </w:r>
+    </w:p>
+    <w:p>
+      <w:pPr>
+        <w:jc w:val="center"/>
+      </w:pPr>
+      <w:r>
+        <w:t>This was the first PCB where I focused heavily on tuning lengths of critical traces. I also became accustomed to 4-layer board design; using the layer order found below:</w:t>
       </w:r>
     </w:p>
     <w:p>
@@ -406,34 +548,137 @@
       </w:r>
     </w:p>
     <w:p>
-      <w:pPr>
-        <w:pStyle w:val="ListParagraph"/>
-        <w:jc w:val="center"/>
-      </w:pPr>
+      <w:r>
+        <w:br w:type="page"/>
+      </w:r>
+    </w:p>
+    <w:p>
       <w:r>
         <w:lastRenderedPageBreak/>
-        <w:t xml:space="preserve">Once remade, I received a final stamp of approval for the design. I created a Bill of Materials (BOM) with component specifications and a Standard Operating Procedure (SOP) for assembly/usage guidelines. Voila </w:t>
-      </w:r>
+        <w:t>&lt;- Back to Projects</w:t>
+      </w:r>
+    </w:p>
+    <w:p>
       <w:r>
         <w:rPr>
           <w:rFonts w:ascii="Segoe UI Emoji" w:hAnsi="Segoe UI Emoji" w:cs="Segoe UI Emoji"/>
+          <w:b/>
+          <w:bCs/>
         </w:rPr>
-        <w:t>😤</w:t>
-      </w:r>
-    </w:p>
-    <w:p>
-      <w:pPr>
-        <w:jc w:val="center"/>
+        <w:t>✨</w:t>
+      </w:r>
+      <w:r>
         <w:rPr>
-          <w:caps/>
+          <w:b/>
+          <w:bCs/>
         </w:rPr>
-      </w:pPr>
-      <w:r>
-        <w:t>[</w:t>
-      </w:r>
-      <w:r>
-        <w:t>picture teensy-daughtercard</w:t>
-      </w:r>
+        <w:t xml:space="preserve"> </w:t>
+      </w:r>
+      <w:r>
+        <w:t xml:space="preserve">Completed | Hardware | </w:t>
+      </w:r>
+      <w:proofErr w:type="spellStart"/>
+      <w:r>
+        <w:t>KiCad</w:t>
+      </w:r>
+      <w:proofErr w:type="spellEnd"/>
+      <w:r>
+        <w:t xml:space="preserve"> | PCB Design</w:t>
+      </w:r>
+    </w:p>
+    <w:p>
+      <w:r>
+        <w:t>Teensy Daughtercard</w:t>
+      </w:r>
+    </w:p>
+    <w:p>
+      <w:r>
+        <w:t>May 2026 - June 2026 | Texas A&amp;M Rocket Engine Design Avionics</w:t>
+      </w:r>
+    </w:p>
+    <w:p>
+      <w:pPr>
+        <w:jc w:val="center"/>
+      </w:pPr>
+      <w:r>
+        <w:t>Subtitle “Context:”</w:t>
+      </w:r>
+    </w:p>
+    <w:p>
+      <w:pPr>
+        <w:jc w:val="center"/>
+      </w:pPr>
+      <w:r>
+        <w:t xml:space="preserve">The </w:t>
+      </w:r>
+      <w:proofErr w:type="spellStart"/>
+      <w:r>
+        <w:t>GigaPCB</w:t>
+      </w:r>
+      <w:proofErr w:type="spellEnd"/>
+      <w:r>
+        <w:t xml:space="preserve"> serves as the primary avionics interface for RED's liquid rocket engine test stand, integrating stepper motor controllers, pressure transducers, and thermocouples. Before the full system could be manufactured, two critical analog subsystems required standalone verification: an LM5069-based inrush current limiter and a stepper motor current monitor.</w:t>
+      </w:r>
+    </w:p>
+    <w:p>
+      <w:pPr>
+        <w:jc w:val="center"/>
+      </w:pPr>
+      <w:r>
+        <w:t>Subtitle “Procedure:”</w:t>
+      </w:r>
+    </w:p>
+    <w:p>
+      <w:pPr>
+        <w:jc w:val="center"/>
+      </w:pPr>
+      <w:r>
+        <w:t xml:space="preserve">This was my first major project for RED. I was provided with a critical path activity to fulfill the design stage of the </w:t>
+      </w:r>
+      <w:proofErr w:type="spellStart"/>
+      <w:r>
+        <w:t>GigaPCB</w:t>
+      </w:r>
+      <w:proofErr w:type="spellEnd"/>
+      <w:r>
+        <w:t xml:space="preserve">. I was provided with several screenshots of the design. Since my team was unexperienced in hardware design, I scheduled weekly meetings to teach members </w:t>
+      </w:r>
+      <w:proofErr w:type="spellStart"/>
+      <w:r>
+        <w:t>KiCAD</w:t>
+      </w:r>
+      <w:proofErr w:type="spellEnd"/>
+      <w:r>
+        <w:t xml:space="preserve"> – while slowly recreating the design.</w:t>
+      </w:r>
+      <w:r>
+        <w:t xml:space="preserve"> By early February, I had created a working draft of the PCB. I recall currently doing a design review while at a club (interesting experience). By 2/10, the design was </w:t>
+      </w:r>
+      <w:r>
+        <w:t>submitted for</w:t>
+      </w:r>
+      <w:r>
+        <w:t xml:space="preserve"> </w:t>
+      </w:r>
+      <w:r>
+        <w:t>order</w:t>
+      </w:r>
+      <w:r>
+        <w:t xml:space="preserve"> and my partner in crime Nikhil created a working BOM.</w:t>
+      </w:r>
+    </w:p>
+    <w:p>
+      <w:pPr>
+        <w:jc w:val="center"/>
+      </w:pPr>
+      <w:r>
+        <w:t>[picture current-</w:t>
+      </w:r>
+      <w:proofErr w:type="spellStart"/>
+      <w:r>
+        <w:t>testboards</w:t>
+      </w:r>
+      <w:proofErr w:type="spellEnd"/>
       <w:r>
         <w:t>]</w:t>
       </w:r>
@@ -443,7 +688,157 @@
         <w:jc w:val="center"/>
       </w:pPr>
       <w:r>
-        <w:t>[Return buttons]</w:t>
+        <w:t xml:space="preserve">Test plans were the next objective in order. Though we had a decent idea of the desired tests, our unfamiliarity with the system meant we were unsure of how the board would interface with other AVI equipment. Unfortunately, guidance in this aspect was minimal until the final day of the project. The PCB/components were ordered on 2/25 and received on 3/5. Delays in this aspect came from business teams having to collaborate with university services and shipping times. However, my team was to go out of town for the entire upcoming week due to Spring Break. </w:t>
+      </w:r>
+    </w:p>
+    <w:p>
+      <w:pPr>
+        <w:jc w:val="center"/>
+      </w:pPr>
+      <w:r>
+        <w:t>Upon return, immense pressure was present to get the boards assembled and tested.</w:t>
+      </w:r>
+      <w:r>
+        <w:t xml:space="preserve"> I recall driving into College Station from McAllen and immediately heading to the workstation to become accustomed to supply locations and tools. Unfortunately, our components were scattered across boxes, and the soldering iron was dull. To make matters worse, I missed a major flaw in the PCB. The NMOs pads were not exposed since they were not defined in the mask layer. </w:t>
+      </w:r>
+      <w:r>
+        <w:t>At first glance, the board appeared unusable</w:t>
+      </w:r>
+      <w:r>
+        <w:t xml:space="preserve">. This was a point where I nearly had buckled, since another week of delays and hundreds of </w:t>
+      </w:r>
+      <w:r>
+        <w:lastRenderedPageBreak/>
+        <w:t xml:space="preserve">dollars in costs would be a decisive defeat for me on my first (and critical path) project. We realized, however, that the copper traces were still there and present on the top layer of the board. </w:t>
+      </w:r>
+      <w:r>
+        <w:t>Thus, r</w:t>
+      </w:r>
+      <w:r>
+        <w:t>ather than scrapping the PCB and waiting weeks for a revision, we carefully removed the solder mask by hand to expose the underlying copper and recovered the board.</w:t>
+      </w:r>
+      <w:r>
+        <w:t xml:space="preserve"> </w:t>
+      </w:r>
+      <w:r>
+        <w:t>With this done, assembly would resume…</w:t>
+      </w:r>
+    </w:p>
+    <w:p>
+      <w:pPr>
+        <w:jc w:val="center"/>
+      </w:pPr>
+      <w:r>
+        <w:t xml:space="preserve">I spent several late nights living in the lab with my AVI peers. </w:t>
+      </w:r>
+      <w:r>
+        <w:t>On 3/18, we realized that LM5069</w:t>
+      </w:r>
+      <w:r>
+        <w:t xml:space="preserve"> was nowhere to be found. That night, I saw the order sheet and realized that the desired LM5069 part that management </w:t>
+      </w:r>
+      <w:r>
+        <w:t>requested</w:t>
+      </w:r>
+      <w:r>
+        <w:t xml:space="preserve"> was out of stock. </w:t>
+      </w:r>
+      <w:r>
+        <w:t xml:space="preserve">Luckily, an alternative LM5069 package was successfully ordered the following day. </w:t>
+      </w:r>
+      <w:r>
+        <w:t xml:space="preserve">On 3/19, I recall being 30 minutes late for a seminar since I was at a friend’s house using his soldering station to finish this project. </w:t>
+      </w:r>
+      <w:r>
+        <w:t>At this point, it was now 99% assembled. Below are pictures of how the board currently looked and a cool shot of it zoomed in (don’t mind the extensive flux that makes it look super greasy).</w:t>
+      </w:r>
+    </w:p>
+    <w:p>
+      <w:pPr>
+        <w:jc w:val="center"/>
+      </w:pPr>
+      <w:r>
+        <w:t>[picture current-</w:t>
+      </w:r>
+      <w:proofErr w:type="spellStart"/>
+      <w:r>
+        <w:t>testboards</w:t>
+      </w:r>
+      <w:proofErr w:type="spellEnd"/>
+      <w:r>
+        <w:t>-assembly]</w:t>
+      </w:r>
+    </w:p>
+    <w:p>
+      <w:pPr>
+        <w:jc w:val="center"/>
+      </w:pPr>
+      <w:r>
+        <w:t>[picture current-</w:t>
+      </w:r>
+      <w:proofErr w:type="spellStart"/>
+      <w:r>
+        <w:t>testboards</w:t>
+      </w:r>
+      <w:proofErr w:type="spellEnd"/>
+      <w:r>
+        <w:t>-zoomed-in]</w:t>
+      </w:r>
+    </w:p>
+    <w:p>
+      <w:pPr>
+        <w:jc w:val="center"/>
+      </w:pPr>
+      <w:r>
+        <w:t>Initial testing occurred on 3/29. According to the LM5069 data sheet, the GATE pin should be 12V above the output (VRPS line). We powered the test board to 36V and saw no functionality out of the NMOS.</w:t>
+      </w:r>
+      <w:r>
+        <w:t xml:space="preserve"> This failure resulted in an alternative inrush current limiting method being added (thermistor). Reasons for failure could be attributed to previous design flaws or whatnot. On 4/2, stepper motor current monitor testing occurred with guidance of a higher up. This introduced me to how these motors operated. This test ended up successful, though considerations were made into removing the op-amp buffer stage. With that, the project was concluded and the </w:t>
+      </w:r>
+      <w:proofErr w:type="spellStart"/>
+      <w:r>
+        <w:t>GigaPCB</w:t>
+      </w:r>
+      <w:proofErr w:type="spellEnd"/>
+      <w:r>
+        <w:t xml:space="preserve"> was ordered on 4/5.</w:t>
+      </w:r>
+    </w:p>
+    <w:p>
+      <w:pPr>
+        <w:jc w:val="center"/>
+      </w:pPr>
+      <w:r>
+        <w:t>Subtitle “</w:t>
+      </w:r>
+      <w:r>
+        <w:t>What Was Learned</w:t>
+      </w:r>
+      <w:r>
+        <w:t>:”</w:t>
+      </w:r>
+    </w:p>
+    <w:p>
+      <w:pPr>
+        <w:jc w:val="center"/>
+      </w:pPr>
+      <w:r>
+        <w:t xml:space="preserve">Looking back, this was </w:t>
+      </w:r>
+      <w:r>
+        <w:t xml:space="preserve">one of the hardest hardware </w:t>
+      </w:r>
+      <w:r>
+        <w:t>project</w:t>
+      </w:r>
+      <w:r>
+        <w:t>s</w:t>
+      </w:r>
+      <w:r>
+        <w:t xml:space="preserve"> I have ever done. There was a combination of personal failures, major communication inconsistencies, and immense pressure. Doing this in parallel with the Course Corrector and FE Electrical &amp; Computer was insane. However, there was a beauty to this project. I learned how one must be able to improvise when working on any electrical project. This came when exposing our NMOS pads to bridge a connection to see our current monitor work due to the op amp getting fried. I learned that engineering comes with adversity, and there will be decisive struggles in any project. Finally, I can appreciate the friendships made during the process and being able to both teach and be taught how to operate with hardware. </w:t>
+      </w:r>
+      <w:r>
+        <w:t>Thus, this is a project I will hold with me for the rest of time as a major growing point.</w:t>
       </w:r>
     </w:p>
     <w:p>

</xml_diff>

<commit_message>
Added pages for all projects, FE blog filled
</commit_message>
<xml_diff>
--- a/auredia-man-script.docx
+++ b/auredia-man-script.docx
@@ -732,19 +732,7 @@
         <w:t xml:space="preserve">I spent several late nights living in the lab with my AVI peers. </w:t>
       </w:r>
       <w:r>
-        <w:t>On 3/18, we realized that LM5069</w:t>
-      </w:r>
-      <w:r>
-        <w:t xml:space="preserve"> was nowhere to be found. That night, I saw the order sheet and realized that the desired LM5069 part that management </w:t>
-      </w:r>
-      <w:r>
-        <w:t>requested</w:t>
-      </w:r>
-      <w:r>
-        <w:t xml:space="preserve"> was out of stock. </w:t>
-      </w:r>
-      <w:r>
-        <w:t xml:space="preserve">Luckily, an alternative LM5069 package was successfully ordered the following day. </w:t>
+        <w:t xml:space="preserve">On 3/18, we realized that LM5069 was nowhere to be found. That night, I saw the order sheet and realized that the desired LM5069 part that management requested was out of stock. Luckily, an alternative LM5069 package was successfully ordered the following day. </w:t>
       </w:r>
       <w:r>
         <w:t xml:space="preserve">On 3/19, I recall being 30 minutes late for a seminar since I was at a friend’s house using his soldering station to finish this project. </w:t>
@@ -809,13 +797,7 @@
         <w:jc w:val="center"/>
       </w:pPr>
       <w:r>
-        <w:t>Subtitle “</w:t>
-      </w:r>
-      <w:r>
-        <w:t>What Was Learned</w:t>
-      </w:r>
-      <w:r>
-        <w:t>:”</w:t>
+        <w:t>Subtitle “What Was Learned:”</w:t>
       </w:r>
     </w:p>
     <w:p>
@@ -840,6 +822,854 @@
       <w:r>
         <w:t>Thus, this is a project I will hold with me for the rest of time as a major growing point.</w:t>
       </w:r>
+    </w:p>
+    <w:p>
+      <w:pPr>
+        <w:jc w:val="center"/>
+      </w:pPr>
+    </w:p>
+    <w:p>
+      <w:r>
+        <w:lastRenderedPageBreak/>
+        <w:t>&lt;- Back to Projects</w:t>
+      </w:r>
+    </w:p>
+    <w:p>
+      <w:r>
+        <w:rPr>
+          <w:rFonts w:ascii="Segoe UI Emoji" w:hAnsi="Segoe UI Emoji" w:cs="Segoe UI Emoji"/>
+          <w:b/>
+          <w:bCs/>
+        </w:rPr>
+        <w:t>✨</w:t>
+      </w:r>
+      <w:r>
+        <w:rPr>
+          <w:b/>
+          <w:bCs/>
+        </w:rPr>
+        <w:t xml:space="preserve"> </w:t>
+      </w:r>
+      <w:r>
+        <w:t xml:space="preserve">Completed | </w:t>
+      </w:r>
+      <w:r>
+        <w:t>NCEES FE Exam</w:t>
+      </w:r>
+      <w:r>
+        <w:t xml:space="preserve"> | </w:t>
+      </w:r>
+      <w:r>
+        <w:t>Electrical Engineering | Computer Engineering</w:t>
+      </w:r>
+    </w:p>
+    <w:p>
+      <w:r>
+        <w:t>FE Electrical and Computer</w:t>
+      </w:r>
+    </w:p>
+    <w:p>
+      <w:r>
+        <w:t>January</w:t>
+      </w:r>
+      <w:r>
+        <w:t xml:space="preserve"> - </w:t>
+      </w:r>
+      <w:r>
+        <w:t>April</w:t>
+      </w:r>
+      <w:r>
+        <w:t xml:space="preserve"> 2026 | </w:t>
+      </w:r>
+      <w:r>
+        <w:t>National Council of Examiners for Engineering and Surveying</w:t>
+      </w:r>
+    </w:p>
+    <w:p>
+      <w:pPr>
+        <w:jc w:val="center"/>
+      </w:pPr>
+      <w:r>
+        <w:t>Subtitle “Context:”</w:t>
+      </w:r>
+    </w:p>
+    <w:p>
+      <w:pPr>
+        <w:jc w:val="center"/>
+      </w:pPr>
+      <w:r>
+        <w:t>The Fundamentals of Engineering (FE) Exam is a comprehensive six-hour exam that tests the foundational knowledge expected of recent engineering graduates. Passing the FE exam is a major milestone, as it qualifies you to become an Engineer in Training (EIT)</w:t>
+      </w:r>
+      <w:r>
+        <w:t xml:space="preserve"> – the </w:t>
+      </w:r>
+      <w:r>
+        <w:t>first step toward</w:t>
+      </w:r>
+      <w:r>
+        <w:t>s</w:t>
+      </w:r>
+      <w:r>
+        <w:t xml:space="preserve"> earning a Professional Engineer (PE) license. For the FE Electrical and Computer Exam, </w:t>
+      </w:r>
+      <w:r>
+        <w:t>the following concepts are tested (as of 7/2026):</w:t>
+      </w:r>
+    </w:p>
+    <w:p>
+      <w:pPr>
+        <w:jc w:val="center"/>
+      </w:pPr>
+      <w:r>
+        <w:t xml:space="preserve">[picture </w:t>
+      </w:r>
+      <w:proofErr w:type="spellStart"/>
+      <w:r>
+        <w:t>fe</w:t>
+      </w:r>
+      <w:proofErr w:type="spellEnd"/>
+      <w:r>
+        <w:t>-context]</w:t>
+      </w:r>
+    </w:p>
+    <w:p>
+      <w:pPr>
+        <w:jc w:val="center"/>
+      </w:pPr>
+      <w:r>
+        <w:t>Subtitle “Result:”</w:t>
+      </w:r>
+    </w:p>
+    <w:p>
+      <w:pPr>
+        <w:jc w:val="center"/>
+      </w:pPr>
+      <w:r>
+        <w:t xml:space="preserve">[picture </w:t>
+      </w:r>
+      <w:proofErr w:type="spellStart"/>
+      <w:r>
+        <w:t>fe</w:t>
+      </w:r>
+      <w:proofErr w:type="spellEnd"/>
+      <w:r>
+        <w:t>-results]</w:t>
+      </w:r>
+    </w:p>
+    <w:p>
+      <w:pPr>
+        <w:jc w:val="center"/>
+      </w:pPr>
+      <w:r>
+        <w:t>Subtitle “Study Resources:”</w:t>
+      </w:r>
+    </w:p>
+    <w:p>
+      <w:pPr>
+        <w:jc w:val="center"/>
+      </w:pPr>
+      <w:r>
+        <w:t>Below is a tabl</w:t>
+      </w:r>
+      <w:r>
+        <w:t xml:space="preserve">e containing recommended study materials for the FE Electrical and Computer Exam. I personally performed a workflow where I would review/learn concepts via </w:t>
+      </w:r>
+      <w:proofErr w:type="spellStart"/>
+      <w:r>
+        <w:t>ElectricalFEReview</w:t>
+      </w:r>
+      <w:proofErr w:type="spellEnd"/>
+      <w:r>
+        <w:t xml:space="preserve"> and then perform practice sets on </w:t>
+      </w:r>
+      <w:proofErr w:type="spellStart"/>
+      <w:r>
+        <w:t>PrepFE</w:t>
+      </w:r>
+      <w:proofErr w:type="spellEnd"/>
+      <w:r>
+        <w:t>. I used the days before my exam to take the NCEES Official Practice Exam – a great benchmark material as it reads just as the exam would. I have also heard great things about Wasim’s Course so I would recommend that you are willing to spend the money. Finally, the Official Reference Handbook is the most important study material. Cross reference what you are reviewing with the handbook to become familiar with it, for it has nearly every equation required to pass the exam. Finally, I would recommend buying a TI-36X; a cheap calculator allowed for the exam that performs similarly to the standardized TI-84. It comes with easy access to matrix calculations, vector calculations, imaginary calculations, etc.</w:t>
+      </w:r>
+    </w:p>
+    <w:tbl>
+      <w:tblPr>
+        <w:tblW w:w="9440" w:type="dxa"/>
+        <w:tblCellMar>
+          <w:top w:w="15" w:type="dxa"/>
+          <w:left w:w="15" w:type="dxa"/>
+          <w:bottom w:w="15" w:type="dxa"/>
+          <w:right w:w="15" w:type="dxa"/>
+        </w:tblCellMar>
+        <w:tblLook w:val="04A0" w:firstRow="1" w:lastRow="0" w:firstColumn="1" w:lastColumn="0" w:noHBand="0" w:noVBand="1"/>
+      </w:tblPr>
+      <w:tblGrid>
+        <w:gridCol w:w="3255"/>
+        <w:gridCol w:w="2656"/>
+        <w:gridCol w:w="3529"/>
+      </w:tblGrid>
+      <w:tr>
+        <w:trPr>
+          <w:trHeight w:val="240"/>
+        </w:trPr>
+        <w:tc>
+          <w:tcPr>
+            <w:tcW w:w="0" w:type="auto"/>
+            <w:tcBorders>
+              <w:top w:val="single" w:sz="8" w:space="0" w:color="000000"/>
+              <w:left w:val="single" w:sz="8" w:space="0" w:color="000000"/>
+              <w:bottom w:val="single" w:sz="8" w:space="0" w:color="000000"/>
+              <w:right w:val="single" w:sz="8" w:space="0" w:color="000000"/>
+            </w:tcBorders>
+            <w:shd w:val="clear" w:color="auto" w:fill="EFEFEF"/>
+            <w:tcMar>
+              <w:top w:w="100" w:type="dxa"/>
+              <w:left w:w="100" w:type="dxa"/>
+              <w:bottom w:w="100" w:type="dxa"/>
+              <w:right w:w="100" w:type="dxa"/>
+            </w:tcMar>
+            <w:hideMark/>
+          </w:tcPr>
+          <w:p>
+            <w:pPr>
+              <w:jc w:val="center"/>
+            </w:pPr>
+            <w:r>
+              <w:rPr>
+                <w:b/>
+                <w:bCs/>
+              </w:rPr>
+              <w:t>Resource</w:t>
+            </w:r>
+          </w:p>
+        </w:tc>
+        <w:tc>
+          <w:tcPr>
+            <w:tcW w:w="0" w:type="auto"/>
+            <w:tcBorders>
+              <w:top w:val="single" w:sz="8" w:space="0" w:color="000000"/>
+              <w:left w:val="single" w:sz="8" w:space="0" w:color="000000"/>
+              <w:bottom w:val="single" w:sz="8" w:space="0" w:color="000000"/>
+              <w:right w:val="single" w:sz="8" w:space="0" w:color="000000"/>
+            </w:tcBorders>
+            <w:shd w:val="clear" w:color="auto" w:fill="EFEFEF"/>
+            <w:tcMar>
+              <w:top w:w="100" w:type="dxa"/>
+              <w:left w:w="100" w:type="dxa"/>
+              <w:bottom w:w="100" w:type="dxa"/>
+              <w:right w:w="100" w:type="dxa"/>
+            </w:tcMar>
+            <w:hideMark/>
+          </w:tcPr>
+          <w:p>
+            <w:pPr>
+              <w:jc w:val="center"/>
+            </w:pPr>
+            <w:r>
+              <w:rPr>
+                <w:b/>
+                <w:bCs/>
+              </w:rPr>
+              <w:t>Purpose</w:t>
+            </w:r>
+          </w:p>
+        </w:tc>
+        <w:tc>
+          <w:tcPr>
+            <w:tcW w:w="3529" w:type="dxa"/>
+            <w:tcBorders>
+              <w:top w:val="single" w:sz="8" w:space="0" w:color="000000"/>
+              <w:left w:val="single" w:sz="8" w:space="0" w:color="000000"/>
+              <w:bottom w:val="single" w:sz="8" w:space="0" w:color="000000"/>
+              <w:right w:val="single" w:sz="8" w:space="0" w:color="000000"/>
+            </w:tcBorders>
+            <w:shd w:val="clear" w:color="auto" w:fill="EFEFEF"/>
+            <w:tcMar>
+              <w:top w:w="100" w:type="dxa"/>
+              <w:left w:w="100" w:type="dxa"/>
+              <w:bottom w:w="100" w:type="dxa"/>
+              <w:right w:w="100" w:type="dxa"/>
+            </w:tcMar>
+            <w:hideMark/>
+          </w:tcPr>
+          <w:p>
+            <w:pPr>
+              <w:jc w:val="center"/>
+            </w:pPr>
+            <w:r>
+              <w:rPr>
+                <w:b/>
+                <w:bCs/>
+              </w:rPr>
+              <w:t>Cost</w:t>
+            </w:r>
+          </w:p>
+        </w:tc>
+      </w:tr>
+      <w:tr>
+        <w:tc>
+          <w:tcPr>
+            <w:tcW w:w="0" w:type="auto"/>
+            <w:tcBorders>
+              <w:top w:val="single" w:sz="8" w:space="0" w:color="000000"/>
+              <w:left w:val="single" w:sz="8" w:space="0" w:color="000000"/>
+              <w:bottom w:val="single" w:sz="8" w:space="0" w:color="000000"/>
+              <w:right w:val="single" w:sz="8" w:space="0" w:color="000000"/>
+            </w:tcBorders>
+            <w:tcMar>
+              <w:top w:w="100" w:type="dxa"/>
+              <w:left w:w="100" w:type="dxa"/>
+              <w:bottom w:w="100" w:type="dxa"/>
+              <w:right w:w="100" w:type="dxa"/>
+            </w:tcMar>
+            <w:hideMark/>
+          </w:tcPr>
+          <w:p>
+            <w:pPr>
+              <w:jc w:val="center"/>
+            </w:pPr>
+            <w:hyperlink r:id="rId5" w:history="1">
+              <w:proofErr w:type="spellStart"/>
+              <w:r>
+                <w:rPr>
+                  <w:rStyle w:val="Hyperlink"/>
+                </w:rPr>
+                <w:t>ElectricalFEreview</w:t>
+              </w:r>
+              <w:proofErr w:type="spellEnd"/>
+            </w:hyperlink>
+          </w:p>
+        </w:tc>
+        <w:tc>
+          <w:tcPr>
+            <w:tcW w:w="0" w:type="auto"/>
+            <w:tcBorders>
+              <w:top w:val="single" w:sz="8" w:space="0" w:color="000000"/>
+              <w:left w:val="single" w:sz="8" w:space="0" w:color="000000"/>
+              <w:bottom w:val="single" w:sz="8" w:space="0" w:color="000000"/>
+              <w:right w:val="single" w:sz="8" w:space="0" w:color="000000"/>
+            </w:tcBorders>
+            <w:tcMar>
+              <w:top w:w="100" w:type="dxa"/>
+              <w:left w:w="100" w:type="dxa"/>
+              <w:bottom w:w="100" w:type="dxa"/>
+              <w:right w:w="100" w:type="dxa"/>
+            </w:tcMar>
+            <w:hideMark/>
+          </w:tcPr>
+          <w:p>
+            <w:pPr>
+              <w:jc w:val="center"/>
+            </w:pPr>
+            <w:r>
+              <w:t>Learn Concepts</w:t>
+            </w:r>
+          </w:p>
+        </w:tc>
+        <w:tc>
+          <w:tcPr>
+            <w:tcW w:w="3529" w:type="dxa"/>
+            <w:tcBorders>
+              <w:top w:val="single" w:sz="8" w:space="0" w:color="000000"/>
+              <w:left w:val="single" w:sz="8" w:space="0" w:color="000000"/>
+              <w:bottom w:val="single" w:sz="8" w:space="0" w:color="000000"/>
+              <w:right w:val="single" w:sz="8" w:space="0" w:color="000000"/>
+            </w:tcBorders>
+            <w:tcMar>
+              <w:top w:w="100" w:type="dxa"/>
+              <w:left w:w="100" w:type="dxa"/>
+              <w:bottom w:w="100" w:type="dxa"/>
+              <w:right w:w="100" w:type="dxa"/>
+            </w:tcMar>
+            <w:hideMark/>
+          </w:tcPr>
+          <w:p>
+            <w:pPr>
+              <w:jc w:val="center"/>
+            </w:pPr>
+            <w:r>
+              <w:t>Free</w:t>
+            </w:r>
+          </w:p>
+        </w:tc>
+      </w:tr>
+      <w:tr>
+        <w:tc>
+          <w:tcPr>
+            <w:tcW w:w="0" w:type="auto"/>
+            <w:tcBorders>
+              <w:top w:val="single" w:sz="8" w:space="0" w:color="000000"/>
+              <w:left w:val="single" w:sz="8" w:space="0" w:color="000000"/>
+              <w:bottom w:val="single" w:sz="8" w:space="0" w:color="000000"/>
+              <w:right w:val="single" w:sz="8" w:space="0" w:color="000000"/>
+            </w:tcBorders>
+            <w:tcMar>
+              <w:top w:w="100" w:type="dxa"/>
+              <w:left w:w="100" w:type="dxa"/>
+              <w:bottom w:w="100" w:type="dxa"/>
+              <w:right w:w="100" w:type="dxa"/>
+            </w:tcMar>
+            <w:hideMark/>
+          </w:tcPr>
+          <w:p>
+            <w:pPr>
+              <w:jc w:val="center"/>
+            </w:pPr>
+            <w:hyperlink r:id="rId6" w:history="1">
+              <w:proofErr w:type="spellStart"/>
+              <w:r>
+                <w:rPr>
+                  <w:rStyle w:val="Hyperlink"/>
+                </w:rPr>
+                <w:t>PrepFE</w:t>
+              </w:r>
+              <w:proofErr w:type="spellEnd"/>
+            </w:hyperlink>
+          </w:p>
+        </w:tc>
+        <w:tc>
+          <w:tcPr>
+            <w:tcW w:w="0" w:type="auto"/>
+            <w:tcBorders>
+              <w:top w:val="single" w:sz="8" w:space="0" w:color="000000"/>
+              <w:left w:val="single" w:sz="8" w:space="0" w:color="000000"/>
+              <w:bottom w:val="single" w:sz="8" w:space="0" w:color="000000"/>
+              <w:right w:val="single" w:sz="8" w:space="0" w:color="000000"/>
+            </w:tcBorders>
+            <w:tcMar>
+              <w:top w:w="100" w:type="dxa"/>
+              <w:left w:w="100" w:type="dxa"/>
+              <w:bottom w:w="100" w:type="dxa"/>
+              <w:right w:w="100" w:type="dxa"/>
+            </w:tcMar>
+            <w:hideMark/>
+          </w:tcPr>
+          <w:p>
+            <w:pPr>
+              <w:jc w:val="center"/>
+            </w:pPr>
+            <w:r>
+              <w:t>500+ Practice Problems</w:t>
+            </w:r>
+          </w:p>
+        </w:tc>
+        <w:tc>
+          <w:tcPr>
+            <w:tcW w:w="3529" w:type="dxa"/>
+            <w:tcBorders>
+              <w:top w:val="single" w:sz="8" w:space="0" w:color="000000"/>
+              <w:left w:val="single" w:sz="8" w:space="0" w:color="000000"/>
+              <w:bottom w:val="single" w:sz="8" w:space="0" w:color="000000"/>
+              <w:right w:val="single" w:sz="8" w:space="0" w:color="000000"/>
+            </w:tcBorders>
+            <w:tcMar>
+              <w:top w:w="100" w:type="dxa"/>
+              <w:left w:w="100" w:type="dxa"/>
+              <w:bottom w:w="100" w:type="dxa"/>
+              <w:right w:w="100" w:type="dxa"/>
+            </w:tcMar>
+            <w:hideMark/>
+          </w:tcPr>
+          <w:p>
+            <w:pPr>
+              <w:jc w:val="center"/>
+            </w:pPr>
+            <w:r>
+              <w:t>$99.99 for 3 months</w:t>
+            </w:r>
+          </w:p>
+        </w:tc>
+      </w:tr>
+      <w:tr>
+        <w:tc>
+          <w:tcPr>
+            <w:tcW w:w="0" w:type="auto"/>
+            <w:tcBorders>
+              <w:top w:val="single" w:sz="8" w:space="0" w:color="000000"/>
+              <w:left w:val="single" w:sz="8" w:space="0" w:color="000000"/>
+              <w:bottom w:val="single" w:sz="8" w:space="0" w:color="000000"/>
+              <w:right w:val="single" w:sz="8" w:space="0" w:color="000000"/>
+            </w:tcBorders>
+            <w:tcMar>
+              <w:top w:w="100" w:type="dxa"/>
+              <w:left w:w="100" w:type="dxa"/>
+              <w:bottom w:w="100" w:type="dxa"/>
+              <w:right w:w="100" w:type="dxa"/>
+            </w:tcMar>
+            <w:hideMark/>
+          </w:tcPr>
+          <w:p>
+            <w:pPr>
+              <w:jc w:val="center"/>
+            </w:pPr>
+            <w:hyperlink r:id="rId7" w:history="1">
+              <w:r>
+                <w:rPr>
+                  <w:rStyle w:val="Hyperlink"/>
+                </w:rPr>
+                <w:t>NCEES Official Practice Exam</w:t>
+              </w:r>
+            </w:hyperlink>
+          </w:p>
+        </w:tc>
+        <w:tc>
+          <w:tcPr>
+            <w:tcW w:w="0" w:type="auto"/>
+            <w:tcBorders>
+              <w:top w:val="single" w:sz="8" w:space="0" w:color="000000"/>
+              <w:left w:val="single" w:sz="8" w:space="0" w:color="000000"/>
+              <w:bottom w:val="single" w:sz="8" w:space="0" w:color="000000"/>
+              <w:right w:val="single" w:sz="8" w:space="0" w:color="000000"/>
+            </w:tcBorders>
+            <w:tcMar>
+              <w:top w:w="100" w:type="dxa"/>
+              <w:left w:w="100" w:type="dxa"/>
+              <w:bottom w:w="100" w:type="dxa"/>
+              <w:right w:w="100" w:type="dxa"/>
+            </w:tcMar>
+            <w:hideMark/>
+          </w:tcPr>
+          <w:p>
+            <w:pPr>
+              <w:jc w:val="center"/>
+            </w:pPr>
+            <w:r>
+              <w:t>Critical Benchmark</w:t>
+            </w:r>
+          </w:p>
+        </w:tc>
+        <w:tc>
+          <w:tcPr>
+            <w:tcW w:w="3529" w:type="dxa"/>
+            <w:tcBorders>
+              <w:top w:val="single" w:sz="8" w:space="0" w:color="000000"/>
+              <w:left w:val="single" w:sz="8" w:space="0" w:color="000000"/>
+              <w:bottom w:val="single" w:sz="8" w:space="0" w:color="000000"/>
+              <w:right w:val="single" w:sz="8" w:space="0" w:color="000000"/>
+            </w:tcBorders>
+            <w:tcMar>
+              <w:top w:w="100" w:type="dxa"/>
+              <w:left w:w="100" w:type="dxa"/>
+              <w:bottom w:w="100" w:type="dxa"/>
+              <w:right w:w="100" w:type="dxa"/>
+            </w:tcMar>
+            <w:hideMark/>
+          </w:tcPr>
+          <w:p>
+            <w:pPr>
+              <w:jc w:val="center"/>
+            </w:pPr>
+            <w:r>
+              <w:t>$50</w:t>
+            </w:r>
+          </w:p>
+        </w:tc>
+      </w:tr>
+      <w:tr>
+        <w:tc>
+          <w:tcPr>
+            <w:tcW w:w="0" w:type="auto"/>
+            <w:tcBorders>
+              <w:top w:val="single" w:sz="8" w:space="0" w:color="000000"/>
+              <w:left w:val="single" w:sz="8" w:space="0" w:color="000000"/>
+              <w:bottom w:val="single" w:sz="8" w:space="0" w:color="000000"/>
+              <w:right w:val="single" w:sz="8" w:space="0" w:color="000000"/>
+            </w:tcBorders>
+            <w:tcMar>
+              <w:top w:w="100" w:type="dxa"/>
+              <w:left w:w="100" w:type="dxa"/>
+              <w:bottom w:w="100" w:type="dxa"/>
+              <w:right w:w="100" w:type="dxa"/>
+            </w:tcMar>
+            <w:hideMark/>
+          </w:tcPr>
+          <w:p>
+            <w:pPr>
+              <w:jc w:val="center"/>
+            </w:pPr>
+            <w:hyperlink r:id="rId8" w:history="1">
+              <w:r>
+                <w:rPr>
+                  <w:rStyle w:val="Hyperlink"/>
+                </w:rPr>
+                <w:t>Wasim Course</w:t>
+              </w:r>
+            </w:hyperlink>
+          </w:p>
+        </w:tc>
+        <w:tc>
+          <w:tcPr>
+            <w:tcW w:w="0" w:type="auto"/>
+            <w:tcBorders>
+              <w:top w:val="single" w:sz="8" w:space="0" w:color="000000"/>
+              <w:left w:val="single" w:sz="8" w:space="0" w:color="000000"/>
+              <w:bottom w:val="single" w:sz="8" w:space="0" w:color="000000"/>
+              <w:right w:val="single" w:sz="8" w:space="0" w:color="000000"/>
+            </w:tcBorders>
+            <w:tcMar>
+              <w:top w:w="100" w:type="dxa"/>
+              <w:left w:w="100" w:type="dxa"/>
+              <w:bottom w:w="100" w:type="dxa"/>
+              <w:right w:w="100" w:type="dxa"/>
+            </w:tcMar>
+            <w:hideMark/>
+          </w:tcPr>
+          <w:p>
+            <w:pPr>
+              <w:jc w:val="center"/>
+            </w:pPr>
+            <w:r>
+              <w:t>Advised Supplementary</w:t>
+            </w:r>
+          </w:p>
+        </w:tc>
+        <w:tc>
+          <w:tcPr>
+            <w:tcW w:w="3529" w:type="dxa"/>
+            <w:tcBorders>
+              <w:top w:val="single" w:sz="8" w:space="0" w:color="000000"/>
+              <w:left w:val="single" w:sz="8" w:space="0" w:color="000000"/>
+              <w:bottom w:val="single" w:sz="8" w:space="0" w:color="000000"/>
+              <w:right w:val="single" w:sz="8" w:space="0" w:color="000000"/>
+            </w:tcBorders>
+            <w:tcMar>
+              <w:top w:w="100" w:type="dxa"/>
+              <w:left w:w="100" w:type="dxa"/>
+              <w:bottom w:w="100" w:type="dxa"/>
+              <w:right w:w="100" w:type="dxa"/>
+            </w:tcMar>
+            <w:hideMark/>
+          </w:tcPr>
+          <w:p>
+            <w:pPr>
+              <w:jc w:val="center"/>
+            </w:pPr>
+            <w:r>
+              <w:t>&gt;$90.00 [1]</w:t>
+            </w:r>
+          </w:p>
+        </w:tc>
+      </w:tr>
+      <w:tr>
+        <w:trPr>
+          <w:trHeight w:val="60"/>
+        </w:trPr>
+        <w:tc>
+          <w:tcPr>
+            <w:tcW w:w="0" w:type="auto"/>
+            <w:tcBorders>
+              <w:top w:val="single" w:sz="8" w:space="0" w:color="000000"/>
+              <w:left w:val="single" w:sz="8" w:space="0" w:color="000000"/>
+              <w:bottom w:val="single" w:sz="8" w:space="0" w:color="000000"/>
+              <w:right w:val="single" w:sz="8" w:space="0" w:color="000000"/>
+            </w:tcBorders>
+            <w:tcMar>
+              <w:top w:w="100" w:type="dxa"/>
+              <w:left w:w="100" w:type="dxa"/>
+              <w:bottom w:w="100" w:type="dxa"/>
+              <w:right w:w="100" w:type="dxa"/>
+            </w:tcMar>
+            <w:hideMark/>
+          </w:tcPr>
+          <w:p>
+            <w:pPr>
+              <w:jc w:val="center"/>
+            </w:pPr>
+            <w:hyperlink r:id="rId9" w:history="1">
+              <w:r>
+                <w:rPr>
+                  <w:rStyle w:val="Hyperlink"/>
+                </w:rPr>
+                <w:t>Official Referen</w:t>
+              </w:r>
+              <w:r>
+                <w:rPr>
+                  <w:rStyle w:val="Hyperlink"/>
+                </w:rPr>
+                <w:t>c</w:t>
+              </w:r>
+              <w:r>
+                <w:rPr>
+                  <w:rStyle w:val="Hyperlink"/>
+                </w:rPr>
+                <w:t>e Handbook</w:t>
+              </w:r>
+            </w:hyperlink>
+          </w:p>
+        </w:tc>
+        <w:tc>
+          <w:tcPr>
+            <w:tcW w:w="0" w:type="auto"/>
+            <w:tcBorders>
+              <w:top w:val="single" w:sz="8" w:space="0" w:color="000000"/>
+              <w:left w:val="single" w:sz="8" w:space="0" w:color="000000"/>
+              <w:bottom w:val="single" w:sz="8" w:space="0" w:color="000000"/>
+              <w:right w:val="single" w:sz="8" w:space="0" w:color="000000"/>
+            </w:tcBorders>
+            <w:tcMar>
+              <w:top w:w="100" w:type="dxa"/>
+              <w:left w:w="100" w:type="dxa"/>
+              <w:bottom w:w="100" w:type="dxa"/>
+              <w:right w:w="100" w:type="dxa"/>
+            </w:tcMar>
+            <w:hideMark/>
+          </w:tcPr>
+          <w:p>
+            <w:pPr>
+              <w:jc w:val="center"/>
+            </w:pPr>
+            <w:r>
+              <w:t>Usable During Exam</w:t>
+            </w:r>
+          </w:p>
+        </w:tc>
+        <w:tc>
+          <w:tcPr>
+            <w:tcW w:w="3529" w:type="dxa"/>
+            <w:tcBorders>
+              <w:top w:val="single" w:sz="8" w:space="0" w:color="000000"/>
+              <w:left w:val="single" w:sz="8" w:space="0" w:color="000000"/>
+              <w:bottom w:val="single" w:sz="8" w:space="0" w:color="000000"/>
+              <w:right w:val="single" w:sz="8" w:space="0" w:color="000000"/>
+            </w:tcBorders>
+            <w:tcMar>
+              <w:top w:w="100" w:type="dxa"/>
+              <w:left w:w="100" w:type="dxa"/>
+              <w:bottom w:w="100" w:type="dxa"/>
+              <w:right w:w="100" w:type="dxa"/>
+            </w:tcMar>
+            <w:hideMark/>
+          </w:tcPr>
+          <w:p>
+            <w:pPr>
+              <w:jc w:val="center"/>
+            </w:pPr>
+            <w:r>
+              <w:t>Free</w:t>
+            </w:r>
+          </w:p>
+        </w:tc>
+      </w:tr>
+    </w:tbl>
+    <w:p>
+      <w:pPr>
+        <w:jc w:val="center"/>
+      </w:pPr>
+      <w:r>
+        <w:t xml:space="preserve">[caption </w:t>
+      </w:r>
+      <w:r>
+        <w:t>[1] His online course is significantly more expensive, but the book itself is just $90</w:t>
+      </w:r>
+      <w:r>
+        <w:t>]</w:t>
+      </w:r>
+    </w:p>
+    <w:p>
+      <w:pPr>
+        <w:jc w:val="center"/>
+      </w:pPr>
+      <w:r>
+        <w:t>Subtitle “Study Schedule:”</w:t>
+      </w:r>
+    </w:p>
+    <w:p>
+      <w:pPr>
+        <w:jc w:val="center"/>
+      </w:pPr>
+    </w:p>
+    <w:p>
+      <w:pPr>
+        <w:jc w:val="center"/>
+      </w:pPr>
+      <w:r>
+        <w:t>Subtitle “Final Tips:”</w:t>
+      </w:r>
+    </w:p>
+    <w:p>
+      <w:pPr>
+        <w:jc w:val="center"/>
+      </w:pPr>
+      <w:r>
+        <w:t xml:space="preserve">Study with intent to learn </w:t>
+      </w:r>
+      <w:r>
+        <w:t>concepts</w:t>
+      </w:r>
+      <w:r>
+        <w:t>. If you don't understand how a problem was solved, figure it out</w:t>
+      </w:r>
+      <w:r>
+        <w:t>. Some concepts that I refused to take time to learn (convolutions/controls) showed up multiple times on the test.</w:t>
+      </w:r>
+    </w:p>
+    <w:p>
+      <w:pPr>
+        <w:jc w:val="center"/>
+      </w:pPr>
+      <w:r>
+        <w:t>Personally, having a study schedule was what really got me on track. January/February saw me free flow through studying, which only got me through one category. Set a true schedule for yourself and understand that 100% mastery is not needed. Excel at the easier categories and be sufficient in the more challenging ones.</w:t>
+      </w:r>
+    </w:p>
+    <w:p>
+      <w:pPr>
+        <w:jc w:val="center"/>
+      </w:pPr>
+      <w:r>
+        <w:t xml:space="preserve">KNOW YOUR CALCULATOR (exam approved calculator). Especially the matrix, vector, and polar/imaginary functions. Saves so much time. Hint: "stat-vars" list function can find </w:t>
+      </w:r>
+      <w:proofErr w:type="gramStart"/>
+      <w:r>
+        <w:t>mean</w:t>
+      </w:r>
+      <w:proofErr w:type="gramEnd"/>
+      <w:r>
+        <w:t xml:space="preserve">, deviation, variance </w:t>
+      </w:r>
+      <w:proofErr w:type="spellStart"/>
+      <w:r>
+        <w:t>etc</w:t>
+      </w:r>
+      <w:proofErr w:type="spellEnd"/>
+      <w:r>
+        <w:t>, just look up how to on your calculator.</w:t>
+      </w:r>
+    </w:p>
+    <w:p>
+      <w:pPr>
+        <w:jc w:val="center"/>
+      </w:pPr>
+      <w:r>
+        <w:t>Don't study super hard the night before. Review some major concepts. Get good sleep, pack a healthy snack/lunch. They even let me eat outside in my break because the NCEES regulations don't say you can't.</w:t>
+      </w:r>
+    </w:p>
+    <w:p>
+      <w:pPr>
+        <w:jc w:val="center"/>
+      </w:pPr>
+      <w:r>
+        <w:t xml:space="preserve">In the test, flag </w:t>
+      </w:r>
+      <w:proofErr w:type="gramStart"/>
+      <w:r>
+        <w:t>questions to</w:t>
+      </w:r>
+      <w:proofErr w:type="gramEnd"/>
+      <w:r>
+        <w:t xml:space="preserve"> return to them later. Don't spend too long trying to figure one out and run out of time for the easy ones. You can go back to flagged questions easily.</w:t>
+      </w:r>
+    </w:p>
+    <w:p>
+      <w:pPr>
+        <w:jc w:val="center"/>
+      </w:pPr>
+      <w:r>
+        <w:t>Correct answer choices are equally distributed between A, B, C, and D. </w:t>
+      </w:r>
+    </w:p>
+    <w:p>
+      <w:pPr>
+        <w:jc w:val="center"/>
+      </w:pPr>
     </w:p>
     <w:p>
       <w:pPr>
@@ -1985,6 +2815,41 @@
       <w:spacing w:val="5"/>
     </w:rPr>
   </w:style>
+  <w:style w:type="character" w:styleId="Hyperlink">
+    <w:name w:val="Hyperlink"/>
+    <w:basedOn w:val="DefaultParagraphFont"/>
+    <w:uiPriority w:val="99"/>
+    <w:unhideWhenUsed/>
+    <w:rsid w:val="00385943"/>
+    <w:rPr>
+      <w:color w:val="467886" w:themeColor="hyperlink"/>
+      <w:u w:val="single"/>
+    </w:rPr>
+  </w:style>
+  <w:style w:type="character" w:styleId="UnresolvedMention">
+    <w:name w:val="Unresolved Mention"/>
+    <w:basedOn w:val="DefaultParagraphFont"/>
+    <w:uiPriority w:val="99"/>
+    <w:semiHidden/>
+    <w:unhideWhenUsed/>
+    <w:rsid w:val="00385943"/>
+    <w:rPr>
+      <w:color w:val="605E5C"/>
+      <w:shd w:val="clear" w:color="auto" w:fill="E1DFDD"/>
+    </w:rPr>
+  </w:style>
+  <w:style w:type="character" w:styleId="FollowedHyperlink">
+    <w:name w:val="FollowedHyperlink"/>
+    <w:basedOn w:val="DefaultParagraphFont"/>
+    <w:uiPriority w:val="99"/>
+    <w:semiHidden/>
+    <w:unhideWhenUsed/>
+    <w:rsid w:val="00182D94"/>
+    <w:rPr>
+      <w:color w:val="96607D" w:themeColor="followedHyperlink"/>
+      <w:u w:val="single"/>
+    </w:rPr>
+  </w:style>
 </w:styles>
 </file>
 

</xml_diff>

<commit_message>
Added yagi antenna page
</commit_message>
<xml_diff>
--- a/auredia-man-script.docx
+++ b/auredia-man-script.docx
@@ -851,16 +851,7 @@
         <w:t xml:space="preserve"> </w:t>
       </w:r>
       <w:r>
-        <w:t xml:space="preserve">Completed | </w:t>
-      </w:r>
-      <w:r>
-        <w:t>NCEES FE Exam</w:t>
-      </w:r>
-      <w:r>
-        <w:t xml:space="preserve"> | </w:t>
-      </w:r>
-      <w:r>
-        <w:t>Electrical Engineering | Computer Engineering</w:t>
+        <w:t>Completed | NCEES FE Exam | Electrical Engineering | Computer Engineering</w:t>
       </w:r>
     </w:p>
     <w:p>
@@ -1020,7 +1011,7 @@
               <w:bottom w:val="single" w:sz="8" w:space="0" w:color="000000"/>
               <w:right w:val="single" w:sz="8" w:space="0" w:color="000000"/>
             </w:tcBorders>
-            <w:shd w:val="clear" w:color="auto" w:fill="EFEFEF"/>
+            <w:shd w:val="clear" w:color="auto" w:fill="F2F2F2" w:themeFill="background1" w:themeFillShade="F2"/>
             <w:tcMar>
               <w:top w:w="100" w:type="dxa"/>
               <w:left w:w="100" w:type="dxa"/>
@@ -1051,7 +1042,7 @@
               <w:bottom w:val="single" w:sz="8" w:space="0" w:color="000000"/>
               <w:right w:val="single" w:sz="8" w:space="0" w:color="000000"/>
             </w:tcBorders>
-            <w:shd w:val="clear" w:color="auto" w:fill="EFEFEF"/>
+            <w:shd w:val="clear" w:color="auto" w:fill="F2F2F2" w:themeFill="background1" w:themeFillShade="F2"/>
             <w:tcMar>
               <w:top w:w="100" w:type="dxa"/>
               <w:left w:w="100" w:type="dxa"/>
@@ -1082,7 +1073,7 @@
               <w:bottom w:val="single" w:sz="8" w:space="0" w:color="000000"/>
               <w:right w:val="single" w:sz="8" w:space="0" w:color="000000"/>
             </w:tcBorders>
-            <w:shd w:val="clear" w:color="auto" w:fill="EFEFEF"/>
+            <w:shd w:val="clear" w:color="auto" w:fill="F2F2F2" w:themeFill="background1" w:themeFillShade="F2"/>
             <w:tcMar>
               <w:top w:w="100" w:type="dxa"/>
               <w:left w:w="100" w:type="dxa"/>
@@ -1479,19 +1470,7 @@
                 <w:rPr>
                   <w:rStyle w:val="Hyperlink"/>
                 </w:rPr>
-                <w:t>Official Referen</w:t>
-              </w:r>
-              <w:r>
-                <w:rPr>
-                  <w:rStyle w:val="Hyperlink"/>
-                </w:rPr>
-                <w:t>c</w:t>
-              </w:r>
-              <w:r>
-                <w:rPr>
-                  <w:rStyle w:val="Hyperlink"/>
-                </w:rPr>
-                <w:t>e Handbook</w:t>
+                <w:t>Official Reference Handbook</w:t>
               </w:r>
             </w:hyperlink>
           </w:p>
@@ -1555,12 +1534,593 @@
         <w:jc w:val="center"/>
       </w:pPr>
       <w:r>
-        <w:t xml:space="preserve">[caption </w:t>
+        <w:t>{</w:t>
+      </w:r>
+      <w:r>
+        <w:t xml:space="preserve">caption </w:t>
       </w:r>
       <w:r>
         <w:t>[1] His online course is significantly more expensive, but the book itself is just $90</w:t>
       </w:r>
       <w:r>
+        <w:t>}</w:t>
+      </w:r>
+    </w:p>
+    <w:p>
+      <w:pPr>
+        <w:jc w:val="center"/>
+      </w:pPr>
+      <w:r>
+        <w:t>Subtitle “Study Schedule:”</w:t>
+      </w:r>
+    </w:p>
+    <w:p>
+      <w:pPr>
+        <w:jc w:val="center"/>
+      </w:pPr>
+      <w:r>
+        <w:t xml:space="preserve">January and February saw me doing limited study of circuit analysis. These months were big for developing study habits. By Spring Break, I developed </w:t>
+      </w:r>
+      <w:r>
+        <w:t>a</w:t>
+      </w:r>
+      <w:r>
+        <w:t xml:space="preserve"> comprehensive plan </w:t>
+      </w:r>
+      <w:r>
+        <w:t xml:space="preserve">to begin banging out concepts. Shown below was the actuality of my studying schedule, with some weeks being more intensive than others given the priority placed on the FE in reference to other projects/activities. This schedule did result in an intense cram across April, where my whiteboard and I were thrown into asylum (my bedroom). Ultimately, the test was accomplished first try and I got to eat COCO Shrimp afterwards </w:t>
+      </w:r>
+      <w:r>
+        <w:rPr>
+          <w:rFonts w:ascii="Segoe UI Emoji" w:hAnsi="Segoe UI Emoji" w:cs="Segoe UI Emoji"/>
+        </w:rPr>
+        <w:t>🗿</w:t>
+      </w:r>
+    </w:p>
+    <w:tbl>
+      <w:tblPr>
+        <w:tblStyle w:val="TableGrid"/>
+        <w:tblW w:w="0" w:type="auto"/>
+        <w:tblLook w:val="04A0" w:firstRow="1" w:lastRow="0" w:firstColumn="1" w:lastColumn="0" w:noHBand="0" w:noVBand="1"/>
+      </w:tblPr>
+      <w:tblGrid>
+        <w:gridCol w:w="1165"/>
+        <w:gridCol w:w="8185"/>
+      </w:tblGrid>
+      <w:tr>
+        <w:tc>
+          <w:tcPr>
+            <w:tcW w:w="1165" w:type="dxa"/>
+            <w:shd w:val="clear" w:color="auto" w:fill="E8E8E8" w:themeFill="background2"/>
+          </w:tcPr>
+          <w:p>
+            <w:pPr>
+              <w:jc w:val="center"/>
+              <w:rPr>
+                <w:b/>
+                <w:bCs/>
+              </w:rPr>
+            </w:pPr>
+            <w:r>
+              <w:rPr>
+                <w:b/>
+                <w:bCs/>
+              </w:rPr>
+              <w:t>Week of</w:t>
+            </w:r>
+          </w:p>
+        </w:tc>
+        <w:tc>
+          <w:tcPr>
+            <w:tcW w:w="8185" w:type="dxa"/>
+            <w:shd w:val="clear" w:color="auto" w:fill="E8E8E8" w:themeFill="background2"/>
+          </w:tcPr>
+          <w:p>
+            <w:pPr>
+              <w:jc w:val="center"/>
+              <w:rPr>
+                <w:b/>
+                <w:bCs/>
+              </w:rPr>
+            </w:pPr>
+            <w:r>
+              <w:rPr>
+                <w:b/>
+                <w:bCs/>
+              </w:rPr>
+              <w:t>Topics Covered</w:t>
+            </w:r>
+            <w:r>
+              <w:rPr>
+                <w:b/>
+                <w:bCs/>
+              </w:rPr>
+              <w:t xml:space="preserve"> [2]</w:t>
+            </w:r>
+          </w:p>
+        </w:tc>
+      </w:tr>
+      <w:tr>
+        <w:tc>
+          <w:tcPr>
+            <w:tcW w:w="1165" w:type="dxa"/>
+          </w:tcPr>
+          <w:p>
+            <w:pPr>
+              <w:jc w:val="center"/>
+            </w:pPr>
+            <w:r>
+              <w:t>3/8</w:t>
+            </w:r>
+          </w:p>
+        </w:tc>
+        <w:tc>
+          <w:tcPr>
+            <w:tcW w:w="8185" w:type="dxa"/>
+          </w:tcPr>
+          <w:p>
+            <w:pPr>
+              <w:jc w:val="center"/>
+            </w:pPr>
+            <w:r>
+              <w:t xml:space="preserve">Circuit Analysis, Probability and Statistics, </w:t>
+            </w:r>
+            <w:r>
+              <w:t>Engineering Economics</w:t>
+            </w:r>
+          </w:p>
+        </w:tc>
+      </w:tr>
+      <w:tr>
+        <w:tc>
+          <w:tcPr>
+            <w:tcW w:w="1165" w:type="dxa"/>
+          </w:tcPr>
+          <w:p>
+            <w:pPr>
+              <w:jc w:val="center"/>
+            </w:pPr>
+            <w:r>
+              <w:t>3/15</w:t>
+            </w:r>
+          </w:p>
+        </w:tc>
+        <w:tc>
+          <w:tcPr>
+            <w:tcW w:w="8185" w:type="dxa"/>
+          </w:tcPr>
+          <w:p>
+            <w:pPr>
+              <w:jc w:val="center"/>
+            </w:pPr>
+            <w:r>
+              <w:t>Ethics</w:t>
+            </w:r>
+          </w:p>
+        </w:tc>
+      </w:tr>
+      <w:tr>
+        <w:tc>
+          <w:tcPr>
+            <w:tcW w:w="1165" w:type="dxa"/>
+          </w:tcPr>
+          <w:p>
+            <w:pPr>
+              <w:jc w:val="center"/>
+            </w:pPr>
+            <w:r>
+              <w:t>3/22</w:t>
+            </w:r>
+          </w:p>
+        </w:tc>
+        <w:tc>
+          <w:tcPr>
+            <w:tcW w:w="8185" w:type="dxa"/>
+          </w:tcPr>
+          <w:p>
+            <w:pPr>
+              <w:jc w:val="center"/>
+            </w:pPr>
+            <w:r>
+              <w:t>Properties of Electrical Materials</w:t>
+            </w:r>
+          </w:p>
+        </w:tc>
+      </w:tr>
+      <w:tr>
+        <w:tc>
+          <w:tcPr>
+            <w:tcW w:w="1165" w:type="dxa"/>
+          </w:tcPr>
+          <w:p>
+            <w:pPr>
+              <w:jc w:val="center"/>
+            </w:pPr>
+            <w:r>
+              <w:t>3/29</w:t>
+            </w:r>
+          </w:p>
+        </w:tc>
+        <w:tc>
+          <w:tcPr>
+            <w:tcW w:w="8185" w:type="dxa"/>
+          </w:tcPr>
+          <w:p>
+            <w:pPr>
+              <w:jc w:val="center"/>
+            </w:pPr>
+            <w:r>
+              <w:t>Linear Systems, Computer Networks</w:t>
+            </w:r>
+          </w:p>
+        </w:tc>
+      </w:tr>
+      <w:tr>
+        <w:tc>
+          <w:tcPr>
+            <w:tcW w:w="1165" w:type="dxa"/>
+          </w:tcPr>
+          <w:p>
+            <w:pPr>
+              <w:jc w:val="center"/>
+            </w:pPr>
+            <w:r>
+              <w:t>4/5</w:t>
+            </w:r>
+          </w:p>
+        </w:tc>
+        <w:tc>
+          <w:tcPr>
+            <w:tcW w:w="8185" w:type="dxa"/>
+          </w:tcPr>
+          <w:p>
+            <w:pPr>
+              <w:jc w:val="center"/>
+            </w:pPr>
+            <w:r>
+              <w:t xml:space="preserve">Signal Processing, </w:t>
+            </w:r>
+            <w:r>
+              <w:t>Electronics</w:t>
+            </w:r>
+          </w:p>
+        </w:tc>
+      </w:tr>
+      <w:tr>
+        <w:tc>
+          <w:tcPr>
+            <w:tcW w:w="1165" w:type="dxa"/>
+          </w:tcPr>
+          <w:p>
+            <w:pPr>
+              <w:jc w:val="center"/>
+            </w:pPr>
+            <w:r>
+              <w:t>4/12</w:t>
+            </w:r>
+          </w:p>
+        </w:tc>
+        <w:tc>
+          <w:tcPr>
+            <w:tcW w:w="8185" w:type="dxa"/>
+          </w:tcPr>
+          <w:p>
+            <w:pPr>
+              <w:jc w:val="center"/>
+            </w:pPr>
+            <w:r>
+              <w:t>Computer Systems, Power Systems</w:t>
+            </w:r>
+          </w:p>
+        </w:tc>
+      </w:tr>
+      <w:tr>
+        <w:tc>
+          <w:tcPr>
+            <w:tcW w:w="1165" w:type="dxa"/>
+          </w:tcPr>
+          <w:p>
+            <w:pPr>
+              <w:jc w:val="center"/>
+            </w:pPr>
+            <w:r>
+              <w:t>4/19</w:t>
+            </w:r>
+          </w:p>
+        </w:tc>
+        <w:tc>
+          <w:tcPr>
+            <w:tcW w:w="8185" w:type="dxa"/>
+          </w:tcPr>
+          <w:p>
+            <w:pPr>
+              <w:jc w:val="center"/>
+            </w:pPr>
+            <w:r>
+              <w:t>Electromagnetics, Software Engineering, Digital Systems, Communications</w:t>
+            </w:r>
+          </w:p>
+        </w:tc>
+      </w:tr>
+      <w:tr>
+        <w:tc>
+          <w:tcPr>
+            <w:tcW w:w="1165" w:type="dxa"/>
+          </w:tcPr>
+          <w:p>
+            <w:pPr>
+              <w:jc w:val="center"/>
+            </w:pPr>
+            <w:r>
+              <w:t>4/26</w:t>
+            </w:r>
+          </w:p>
+        </w:tc>
+        <w:tc>
+          <w:tcPr>
+            <w:tcW w:w="8185" w:type="dxa"/>
+          </w:tcPr>
+          <w:p>
+            <w:pPr>
+              <w:jc w:val="center"/>
+            </w:pPr>
+            <w:r>
+              <w:t>Controls Systems, Practice Exams</w:t>
+            </w:r>
+          </w:p>
+        </w:tc>
+      </w:tr>
+    </w:tbl>
+    <w:p>
+      <w:pPr>
+        <w:jc w:val="center"/>
+      </w:pPr>
+      <w:r>
+        <w:t>{caption [2] Mathematics covered across all weeks}</w:t>
+      </w:r>
+    </w:p>
+    <w:p>
+      <w:pPr>
+        <w:jc w:val="center"/>
+      </w:pPr>
+      <w:r>
+        <w:t>Subtitle “Final Tips:”</w:t>
+      </w:r>
+    </w:p>
+    <w:p>
+      <w:pPr>
+        <w:jc w:val="center"/>
+      </w:pPr>
+      <w:r>
+        <w:t>Study with intent to learn concepts. If you don't understand how a problem was solved, figure it out</w:t>
+      </w:r>
+      <w:r>
+        <w:t>. Some concepts that I refused to take time to learn (convolutions/controls) showed up multiple times on the test.</w:t>
+      </w:r>
+    </w:p>
+    <w:p>
+      <w:pPr>
+        <w:jc w:val="center"/>
+      </w:pPr>
+      <w:r>
+        <w:t>Personally, having a study schedule was what really got me on track. January/February saw me free flow through studying, which only got me through one category. Set a true schedule for yourself and understand that 100% mastery is not needed. Excel at the easier categories and be sufficient in the more challenging ones.</w:t>
+      </w:r>
+    </w:p>
+    <w:p>
+      <w:pPr>
+        <w:jc w:val="center"/>
+      </w:pPr>
+      <w:r>
+        <w:lastRenderedPageBreak/>
+        <w:t xml:space="preserve">KNOW YOUR CALCULATOR (exam approved calculator). Especially the matrix, vector, and polar/imaginary functions. Saves so much time. Hint: "stat-vars" list function can find </w:t>
+      </w:r>
+      <w:proofErr w:type="gramStart"/>
+      <w:r>
+        <w:t>mean</w:t>
+      </w:r>
+      <w:proofErr w:type="gramEnd"/>
+      <w:r>
+        <w:t xml:space="preserve">, deviation, variance </w:t>
+      </w:r>
+      <w:proofErr w:type="spellStart"/>
+      <w:r>
+        <w:t>etc</w:t>
+      </w:r>
+      <w:proofErr w:type="spellEnd"/>
+      <w:r>
+        <w:t>, just look up how to on your calculator.</w:t>
+      </w:r>
+    </w:p>
+    <w:p>
+      <w:pPr>
+        <w:jc w:val="center"/>
+      </w:pPr>
+      <w:r>
+        <w:t>Don't study super hard the night before. Review some major concepts. Get good sleep, pack a healthy snack/lunch. They even let me eat outside in my break because the NCEES regulations don't say you can't.</w:t>
+      </w:r>
+    </w:p>
+    <w:p>
+      <w:pPr>
+        <w:jc w:val="center"/>
+      </w:pPr>
+      <w:r>
+        <w:t xml:space="preserve">In the test, flag </w:t>
+      </w:r>
+      <w:proofErr w:type="gramStart"/>
+      <w:r>
+        <w:t>questions to</w:t>
+      </w:r>
+      <w:proofErr w:type="gramEnd"/>
+      <w:r>
+        <w:t xml:space="preserve"> return to them later. Don't spend too long trying to figure one out and run out of time for the easy ones. You can go back to flagged questions easily.</w:t>
+      </w:r>
+    </w:p>
+    <w:p>
+      <w:pPr>
+        <w:jc w:val="center"/>
+      </w:pPr>
+      <w:r>
+        <w:t>Correct answer choices are equally distributed between A, B, C, and D. </w:t>
+      </w:r>
+    </w:p>
+    <w:p>
+      <w:r>
+        <w:br w:type="page"/>
+      </w:r>
+    </w:p>
+    <w:p>
+      <w:r>
+        <w:lastRenderedPageBreak/>
+        <w:t>&lt;- Back to Projects</w:t>
+      </w:r>
+    </w:p>
+    <w:p>
+      <w:r>
+        <w:rPr>
+          <w:rFonts w:ascii="Segoe UI Emoji" w:hAnsi="Segoe UI Emoji" w:cs="Segoe UI Emoji"/>
+          <w:b/>
+          <w:bCs/>
+        </w:rPr>
+        <w:t>✨</w:t>
+      </w:r>
+      <w:r>
+        <w:rPr>
+          <w:b/>
+          <w:bCs/>
+        </w:rPr>
+        <w:t xml:space="preserve"> </w:t>
+      </w:r>
+      <w:r>
+        <w:t xml:space="preserve">Completed | </w:t>
+      </w:r>
+      <w:r>
+        <w:t>4nec2 | Antenna Design | RF Engineering</w:t>
+      </w:r>
+    </w:p>
+    <w:p>
+      <w:r>
+        <w:t>95.1 MHz Three Element Yagi Antenna</w:t>
+      </w:r>
+    </w:p>
+    <w:p>
+      <w:r>
+        <w:t>November 2025</w:t>
+      </w:r>
+      <w:r>
+        <w:t xml:space="preserve"> - </w:t>
+      </w:r>
+      <w:r>
+        <w:t>December</w:t>
+      </w:r>
+      <w:r>
+        <w:t xml:space="preserve"> 2026 | </w:t>
+      </w:r>
+      <w:r>
+        <w:t>Electromagnetism</w:t>
+      </w:r>
+    </w:p>
+    <w:p>
+      <w:pPr>
+        <w:jc w:val="center"/>
+      </w:pPr>
+      <w:r>
+        <w:t>Subtitle “Context:”</w:t>
+      </w:r>
+    </w:p>
+    <w:p>
+      <w:pPr>
+        <w:jc w:val="center"/>
+      </w:pPr>
+      <w:r>
+        <w:t xml:space="preserve">Antennas are devices that convert electrical energy into electromagnetic waves for transmission or vice versa for reception. A half-wave </w:t>
+      </w:r>
+      <w:r>
+        <w:t>dipole</w:t>
+      </w:r>
+      <w:r>
+        <w:t xml:space="preserve"> is the most basic antenna, having a total length equal to half the wavelength of the operating frequency.</w:t>
+      </w:r>
+      <w:r>
+        <w:t xml:space="preserve"> </w:t>
+      </w:r>
+      <w:r>
+        <w:t xml:space="preserve">A Yagi (or Yagi-Uda) antenna is a directional antenna that adds parasitic elements to </w:t>
+      </w:r>
+      <w:r>
+        <w:t>a</w:t>
+      </w:r>
+      <w:r>
+        <w:t xml:space="preserve"> half-wave dipole. It consists of a driven element (dipole), a reflector placed behind it, and one or more directors placed in front. These parasitic elements interact via electromagnetic coupling. The reflector pushes energy forward while the director focuses energy </w:t>
+      </w:r>
+      <w:r>
+        <w:t>on</w:t>
+      </w:r>
+      <w:r>
+        <w:t xml:space="preserve"> a forward direction. </w:t>
+      </w:r>
+      <w:r>
+        <w:t>This increases antenna gain while producing a highly directional radiation pattern.</w:t>
+      </w:r>
+    </w:p>
+    <w:p>
+      <w:pPr>
+        <w:jc w:val="center"/>
+      </w:pPr>
+      <w:r>
+        <w:t xml:space="preserve">[picture 3-element </w:t>
+      </w:r>
+      <w:proofErr w:type="spellStart"/>
+      <w:r>
+        <w:t>yagi</w:t>
+      </w:r>
+      <w:proofErr w:type="spellEnd"/>
+      <w:r>
+        <w:t xml:space="preserve"> antenna]</w:t>
+      </w:r>
+    </w:p>
+    <w:p>
+      <w:pPr>
+        <w:jc w:val="center"/>
+      </w:pPr>
+      <w:r>
+        <w:t>FM radio signals are electromagnetic waves that are transmitted in the 88-108 MHz frequency band. When FM waves reach an antenna, the electric field of the wave induces an alternating voltage along the conductors of the antenna. The induced voltage can then be demodulated and processed to extract audio information from the transmitted frequency.</w:t>
+      </w:r>
+    </w:p>
+    <w:p>
+      <w:pPr>
+        <w:jc w:val="center"/>
+      </w:pPr>
+      <w:r>
+        <w:t>Subtitle “</w:t>
+      </w:r>
+      <w:r>
+        <w:t>Design &amp; Simulations</w:t>
+      </w:r>
+      <w:r>
+        <w:t>:”</w:t>
+      </w:r>
+    </w:p>
+    <w:p>
+      <w:pPr>
+        <w:jc w:val="center"/>
+      </w:pPr>
+      <w:r>
+        <w:t>The goal was to design, simulate, construct, and test a 95.1 MHz Yagi antenna that would be capable of connecting to Candy 95.1, an FM broadcast of pop music across Brazos County. Critical measurements needed in designing this antenna are shown below. It is assumed that 0.1 mm is the thickness of our conducting material, giving it an effective radius of 0.05 mm. It is also assumed that the ground plane is free space.</w:t>
+      </w:r>
+    </w:p>
+    <w:p>
+      <w:pPr>
+        <w:jc w:val="center"/>
+      </w:pPr>
+      <w:r>
+        <w:t xml:space="preserve">[picture </w:t>
+      </w:r>
+      <w:proofErr w:type="gramStart"/>
+      <w:r>
+        <w:t>critical-measurements</w:t>
+      </w:r>
+      <w:proofErr w:type="gramEnd"/>
+      <w:r>
         <w:t>]</w:t>
       </w:r>
     </w:p>
@@ -1569,112 +2129,931 @@
         <w:jc w:val="center"/>
       </w:pPr>
       <w:r>
-        <w:t>Subtitle “Study Schedule:”</w:t>
-      </w:r>
-    </w:p>
-    <w:p>
-      <w:pPr>
-        <w:jc w:val="center"/>
-      </w:pPr>
-    </w:p>
-    <w:p>
-      <w:pPr>
-        <w:jc w:val="center"/>
-      </w:pPr>
-      <w:r>
-        <w:t>Subtitle “Final Tips:”</w:t>
-      </w:r>
-    </w:p>
-    <w:p>
-      <w:pPr>
-        <w:jc w:val="center"/>
-      </w:pPr>
-      <w:r>
-        <w:t xml:space="preserve">Study with intent to learn </w:t>
-      </w:r>
-      <w:r>
-        <w:t>concepts</w:t>
-      </w:r>
-      <w:r>
-        <w:t>. If you don't understand how a problem was solved, figure it out</w:t>
-      </w:r>
-      <w:r>
-        <w:t>. Some concepts that I refused to take time to learn (convolutions/controls) showed up multiple times on the test.</w:t>
-      </w:r>
-    </w:p>
-    <w:p>
-      <w:pPr>
-        <w:jc w:val="center"/>
-      </w:pPr>
-      <w:r>
-        <w:t>Personally, having a study schedule was what really got me on track. January/February saw me free flow through studying, which only got me through one category. Set a true schedule for yourself and understand that 100% mastery is not needed. Excel at the easier categories and be sufficient in the more challenging ones.</w:t>
-      </w:r>
-    </w:p>
-    <w:p>
-      <w:pPr>
-        <w:jc w:val="center"/>
-      </w:pPr>
-      <w:r>
-        <w:t xml:space="preserve">KNOW YOUR CALCULATOR (exam approved calculator). Especially the matrix, vector, and polar/imaginary functions. Saves so much time. Hint: "stat-vars" list function can find </w:t>
-      </w:r>
-      <w:proofErr w:type="gramStart"/>
-      <w:r>
-        <w:t>mean</w:t>
-      </w:r>
-      <w:proofErr w:type="gramEnd"/>
-      <w:r>
-        <w:t xml:space="preserve">, deviation, variance </w:t>
+        <w:t xml:space="preserve">The </w:t>
+      </w:r>
+      <w:r>
+        <w:t>antenna geometry was modeled using</w:t>
+      </w:r>
+      <w:r>
+        <w:t xml:space="preserve"> 4nec. This Yagi antenna calculator {</w:t>
+      </w:r>
+      <w:r>
+        <w:t xml:space="preserve"> </w:t>
+      </w:r>
+      <w:hyperlink r:id="rId10" w:history="1">
+        <w:r>
+          <w:rPr>
+            <w:rStyle w:val="Hyperlink"/>
+          </w:rPr>
+          <w:t>https://www.rfwireless-world.com/calculators/3-element-yagi-antenna-calculator</w:t>
+        </w:r>
+      </w:hyperlink>
+      <w:r>
+        <w:t xml:space="preserve">} was used to find a suitable geometry to operate at 95.1 </w:t>
       </w:r>
       <w:proofErr w:type="spellStart"/>
       <w:r>
-        <w:t>etc</w:t>
+        <w:t>MHz.</w:t>
       </w:r>
       <w:proofErr w:type="spellEnd"/>
       <w:r>
-        <w:t>, just look up how to on your calculator.</w:t>
-      </w:r>
-    </w:p>
-    <w:p>
-      <w:pPr>
-        <w:jc w:val="center"/>
-      </w:pPr>
-      <w:r>
-        <w:t>Don't study super hard the night before. Review some major concepts. Get good sleep, pack a healthy snack/lunch. They even let me eat outside in my break because the NCEES regulations don't say you can't.</w:t>
-      </w:r>
-    </w:p>
-    <w:p>
-      <w:pPr>
-        <w:jc w:val="center"/>
-      </w:pPr>
-      <w:r>
-        <w:t xml:space="preserve">In the test, flag </w:t>
-      </w:r>
-      <w:proofErr w:type="gramStart"/>
-      <w:r>
-        <w:t>questions to</w:t>
-      </w:r>
-      <w:proofErr w:type="gramEnd"/>
-      <w:r>
-        <w:t xml:space="preserve"> return to them later. Don't spend too long trying to figure one out and run out of time for the easy ones. You can go back to flagged questions easily.</w:t>
-      </w:r>
-    </w:p>
-    <w:p>
-      <w:pPr>
-        <w:jc w:val="center"/>
-      </w:pPr>
-      <w:r>
-        <w:t>Correct answer choices are equally distributed between A, B, C, and D. </w:t>
-      </w:r>
-    </w:p>
-    <w:p>
-      <w:pPr>
-        <w:jc w:val="center"/>
-      </w:pPr>
-    </w:p>
-    <w:p>
-      <w:pPr>
-        <w:jc w:val="center"/>
-      </w:pPr>
+        <w:t xml:space="preserve"> A good antenna must have a voltage standing wave ratio (VSWR) less than 1.5 at the operating frequency. Initial tests showed the VSWR to be too high,</w:t>
+      </w:r>
+      <w:r>
+        <w:t xml:space="preserve"> with our SWR curve being centered towards a higher frequency. This meant the geometry was too short, and</w:t>
+      </w:r>
+      <w:r>
+        <w:t xml:space="preserve"> adding</w:t>
+      </w:r>
+      <w:r>
+        <w:t xml:space="preserve"> 2% </w:t>
+      </w:r>
+      <w:r>
+        <w:t xml:space="preserve">to all lengths shifted </w:t>
+      </w:r>
+      <w:r>
+        <w:lastRenderedPageBreak/>
+        <w:t>resonance downwards</w:t>
+      </w:r>
+      <w:r>
+        <w:t xml:space="preserve">. </w:t>
+      </w:r>
+      <w:r>
+        <w:t>Thus, making</w:t>
+      </w:r>
+      <w:r>
+        <w:t xml:space="preserve"> VSWR </w:t>
+      </w:r>
+      <w:r>
+        <w:t xml:space="preserve">at </w:t>
+      </w:r>
+      <w:r>
+        <w:t>95.1 MHz 1.16, which is perfectly centered and ready for fabrication. Below are all geometry values, the azimuthal antenna pattern, and VSWR curve of the antenna.</w:t>
+      </w:r>
+    </w:p>
+    <w:tbl>
+      <w:tblPr>
+        <w:tblStyle w:val="TableGrid"/>
+        <w:tblW w:w="0" w:type="auto"/>
+        <w:tblLook w:val="04A0" w:firstRow="1" w:lastRow="0" w:firstColumn="1" w:lastColumn="0" w:noHBand="0" w:noVBand="1"/>
+      </w:tblPr>
+      <w:tblGrid>
+        <w:gridCol w:w="3685"/>
+        <w:gridCol w:w="5665"/>
+      </w:tblGrid>
+      <w:tr>
+        <w:tc>
+          <w:tcPr>
+            <w:tcW w:w="3685" w:type="dxa"/>
+            <w:shd w:val="clear" w:color="auto" w:fill="E8E8E8" w:themeFill="background2"/>
+          </w:tcPr>
+          <w:p>
+            <w:pPr>
+              <w:jc w:val="center"/>
+              <w:rPr>
+                <w:b/>
+                <w:bCs/>
+              </w:rPr>
+            </w:pPr>
+            <w:r>
+              <w:rPr>
+                <w:b/>
+                <w:bCs/>
+              </w:rPr>
+              <w:t>Antenna Part</w:t>
+            </w:r>
+          </w:p>
+        </w:tc>
+        <w:tc>
+          <w:tcPr>
+            <w:tcW w:w="5665" w:type="dxa"/>
+            <w:shd w:val="clear" w:color="auto" w:fill="E8E8E8" w:themeFill="background2"/>
+          </w:tcPr>
+          <w:p>
+            <w:pPr>
+              <w:jc w:val="center"/>
+              <w:rPr>
+                <w:b/>
+                <w:bCs/>
+              </w:rPr>
+            </w:pPr>
+            <w:r>
+              <w:rPr>
+                <w:b/>
+                <w:bCs/>
+              </w:rPr>
+              <w:t>Length (Meters)</w:t>
+            </w:r>
+          </w:p>
+        </w:tc>
+      </w:tr>
+      <w:tr>
+        <w:tc>
+          <w:tcPr>
+            <w:tcW w:w="3685" w:type="dxa"/>
+          </w:tcPr>
+          <w:p>
+            <w:pPr>
+              <w:jc w:val="center"/>
+            </w:pPr>
+            <w:r>
+              <w:t>Reflector Length</w:t>
+            </w:r>
+          </w:p>
+        </w:tc>
+        <w:tc>
+          <w:tcPr>
+            <w:tcW w:w="5665" w:type="dxa"/>
+          </w:tcPr>
+          <w:p>
+            <w:pPr>
+              <w:jc w:val="center"/>
+            </w:pPr>
+            <w:r>
+              <w:t>1.594</w:t>
+            </w:r>
+          </w:p>
+        </w:tc>
+      </w:tr>
+      <w:tr>
+        <w:tc>
+          <w:tcPr>
+            <w:tcW w:w="3685" w:type="dxa"/>
+          </w:tcPr>
+          <w:p>
+            <w:pPr>
+              <w:jc w:val="center"/>
+            </w:pPr>
+            <w:r>
+              <w:t>Dipole Length</w:t>
+            </w:r>
+          </w:p>
+        </w:tc>
+        <w:tc>
+          <w:tcPr>
+            <w:tcW w:w="5665" w:type="dxa"/>
+          </w:tcPr>
+          <w:p>
+            <w:pPr>
+              <w:jc w:val="center"/>
+            </w:pPr>
+            <w:r>
+              <w:t>1.524</w:t>
+            </w:r>
+          </w:p>
+        </w:tc>
+      </w:tr>
+      <w:tr>
+        <w:tc>
+          <w:tcPr>
+            <w:tcW w:w="3685" w:type="dxa"/>
+          </w:tcPr>
+          <w:p>
+            <w:pPr>
+              <w:jc w:val="center"/>
+            </w:pPr>
+            <w:r>
+              <w:t>Director Length</w:t>
+            </w:r>
+          </w:p>
+        </w:tc>
+        <w:tc>
+          <w:tcPr>
+            <w:tcW w:w="5665" w:type="dxa"/>
+          </w:tcPr>
+          <w:p>
+            <w:pPr>
+              <w:jc w:val="center"/>
+            </w:pPr>
+            <w:r>
+              <w:t>1.418</w:t>
+            </w:r>
+          </w:p>
+        </w:tc>
+      </w:tr>
+      <w:tr>
+        <w:tc>
+          <w:tcPr>
+            <w:tcW w:w="3685" w:type="dxa"/>
+          </w:tcPr>
+          <w:p>
+            <w:pPr>
+              <w:jc w:val="center"/>
+            </w:pPr>
+            <w:r>
+              <w:t>Reflector to Dipole Spacing</w:t>
+            </w:r>
+          </w:p>
+        </w:tc>
+        <w:tc>
+          <w:tcPr>
+            <w:tcW w:w="5665" w:type="dxa"/>
+          </w:tcPr>
+          <w:p>
+            <w:pPr>
+              <w:jc w:val="center"/>
+            </w:pPr>
+            <w:r>
+              <w:t>0.394</w:t>
+            </w:r>
+          </w:p>
+        </w:tc>
+      </w:tr>
+      <w:tr>
+        <w:tc>
+          <w:tcPr>
+            <w:tcW w:w="3685" w:type="dxa"/>
+          </w:tcPr>
+          <w:p>
+            <w:pPr>
+              <w:jc w:val="center"/>
+            </w:pPr>
+            <w:r>
+              <w:t>Dipole to Director Spacing</w:t>
+            </w:r>
+          </w:p>
+        </w:tc>
+        <w:tc>
+          <w:tcPr>
+            <w:tcW w:w="5665" w:type="dxa"/>
+          </w:tcPr>
+          <w:p>
+            <w:pPr>
+              <w:jc w:val="center"/>
+            </w:pPr>
+            <w:r>
+              <w:t>0.394</w:t>
+            </w:r>
+          </w:p>
+        </w:tc>
+      </w:tr>
+    </w:tbl>
+    <w:p/>
+    <w:p>
+      <w:pPr>
+        <w:jc w:val="center"/>
+      </w:pPr>
+      <w:r>
+        <w:t>[picture azimuthal-antenna-pattern]</w:t>
+      </w:r>
+    </w:p>
+    <w:p>
+      <w:pPr>
+        <w:jc w:val="center"/>
+      </w:pPr>
+      <w:r>
+        <w:t xml:space="preserve">[picture </w:t>
+      </w:r>
+      <w:proofErr w:type="spellStart"/>
+      <w:r>
+        <w:t>vswr</w:t>
+      </w:r>
+      <w:proofErr w:type="spellEnd"/>
+      <w:r>
+        <w:t>-curve]</w:t>
+      </w:r>
+    </w:p>
+    <w:p>
+      <w:pPr>
+        <w:jc w:val="center"/>
+      </w:pPr>
+      <w:r>
+        <w:t>Subtitle “</w:t>
+      </w:r>
+      <w:r>
+        <w:t>Construction</w:t>
+      </w:r>
+      <w:r>
+        <w:t>”</w:t>
+      </w:r>
+    </w:p>
+    <w:p>
+      <w:pPr>
+        <w:jc w:val="center"/>
+      </w:pPr>
+      <w:r>
+        <w:t>This video</w:t>
+      </w:r>
+      <w:r>
+        <w:t xml:space="preserve"> {</w:t>
+      </w:r>
+      <w:r>
+        <w:t>https://www.youtube.com/watch?v=BmHoQrDfw-0</w:t>
+      </w:r>
+      <w:r>
+        <w:t>} w</w:t>
+      </w:r>
+      <w:r>
+        <w:t>as used as guidance for constructing the antenna. A Bill of Materials (BOM) was generated for all material costs, with soldering stations and testing equipment being provided.</w:t>
+      </w:r>
+    </w:p>
+    <w:tbl>
+      <w:tblPr>
+        <w:tblStyle w:val="TableGrid"/>
+        <w:tblW w:w="0" w:type="auto"/>
+        <w:tblLook w:val="04A0" w:firstRow="1" w:lastRow="0" w:firstColumn="1" w:lastColumn="0" w:noHBand="0" w:noVBand="1"/>
+      </w:tblPr>
+      <w:tblGrid>
+        <w:gridCol w:w="5125"/>
+        <w:gridCol w:w="1440"/>
+        <w:gridCol w:w="1350"/>
+        <w:gridCol w:w="1435"/>
+      </w:tblGrid>
+      <w:tr>
+        <w:tc>
+          <w:tcPr>
+            <w:tcW w:w="5125" w:type="dxa"/>
+            <w:shd w:val="clear" w:color="auto" w:fill="E8E8E8" w:themeFill="background2"/>
+          </w:tcPr>
+          <w:p>
+            <w:pPr>
+              <w:jc w:val="center"/>
+              <w:rPr>
+                <w:b/>
+                <w:bCs/>
+              </w:rPr>
+            </w:pPr>
+            <w:r>
+              <w:rPr>
+                <w:b/>
+                <w:bCs/>
+              </w:rPr>
+              <w:t>Part Description</w:t>
+            </w:r>
+          </w:p>
+        </w:tc>
+        <w:tc>
+          <w:tcPr>
+            <w:tcW w:w="1440" w:type="dxa"/>
+            <w:shd w:val="clear" w:color="auto" w:fill="E8E8E8" w:themeFill="background2"/>
+          </w:tcPr>
+          <w:p>
+            <w:pPr>
+              <w:jc w:val="center"/>
+              <w:rPr>
+                <w:b/>
+                <w:bCs/>
+              </w:rPr>
+            </w:pPr>
+            <w:r>
+              <w:rPr>
+                <w:b/>
+                <w:bCs/>
+              </w:rPr>
+              <w:t>Quantity</w:t>
+            </w:r>
+          </w:p>
+        </w:tc>
+        <w:tc>
+          <w:tcPr>
+            <w:tcW w:w="1350" w:type="dxa"/>
+            <w:shd w:val="clear" w:color="auto" w:fill="E8E8E8" w:themeFill="background2"/>
+          </w:tcPr>
+          <w:p>
+            <w:pPr>
+              <w:jc w:val="center"/>
+              <w:rPr>
+                <w:b/>
+                <w:bCs/>
+              </w:rPr>
+            </w:pPr>
+            <w:r>
+              <w:rPr>
+                <w:b/>
+                <w:bCs/>
+              </w:rPr>
+              <w:t>Unit Price</w:t>
+            </w:r>
+          </w:p>
+        </w:tc>
+        <w:tc>
+          <w:tcPr>
+            <w:tcW w:w="1435" w:type="dxa"/>
+            <w:shd w:val="clear" w:color="auto" w:fill="E8E8E8" w:themeFill="background2"/>
+          </w:tcPr>
+          <w:p>
+            <w:pPr>
+              <w:jc w:val="center"/>
+              <w:rPr>
+                <w:b/>
+                <w:bCs/>
+              </w:rPr>
+            </w:pPr>
+            <w:r>
+              <w:rPr>
+                <w:b/>
+                <w:bCs/>
+              </w:rPr>
+              <w:t>Total Price</w:t>
+            </w:r>
+          </w:p>
+        </w:tc>
+      </w:tr>
+      <w:tr>
+        <w:tc>
+          <w:tcPr>
+            <w:tcW w:w="5125" w:type="dxa"/>
+          </w:tcPr>
+          <w:p>
+            <w:pPr>
+              <w:jc w:val="center"/>
+            </w:pPr>
+            <w:r>
+              <w:rPr>
+                <w:rFonts w:cs="Arial"/>
+                <w:color w:val="000000"/>
+              </w:rPr>
+              <w:t xml:space="preserve">25-foot </w:t>
+            </w:r>
+            <w:proofErr w:type="gramStart"/>
+            <w:r>
+              <w:rPr>
+                <w:rFonts w:cs="Arial"/>
+                <w:color w:val="000000"/>
+              </w:rPr>
+              <w:t>1-inch wide</w:t>
+            </w:r>
+            <w:proofErr w:type="gramEnd"/>
+            <w:r>
+              <w:rPr>
+                <w:rFonts w:cs="Arial"/>
+                <w:color w:val="000000"/>
+              </w:rPr>
+              <w:t xml:space="preserve"> Steel Tape Measure</w:t>
+            </w:r>
+          </w:p>
+        </w:tc>
+        <w:tc>
+          <w:tcPr>
+            <w:tcW w:w="1440" w:type="dxa"/>
+          </w:tcPr>
+          <w:p>
+            <w:pPr>
+              <w:jc w:val="center"/>
+            </w:pPr>
+            <w:r>
+              <w:rPr>
+                <w:rFonts w:cs="Arial"/>
+                <w:color w:val="000000"/>
+              </w:rPr>
+              <w:t>2</w:t>
+            </w:r>
+          </w:p>
+        </w:tc>
+        <w:tc>
+          <w:tcPr>
+            <w:tcW w:w="1350" w:type="dxa"/>
+          </w:tcPr>
+          <w:p>
+            <w:pPr>
+              <w:jc w:val="center"/>
+            </w:pPr>
+            <w:r>
+              <w:rPr>
+                <w:rFonts w:cs="Arial"/>
+                <w:color w:val="000000"/>
+              </w:rPr>
+              <w:t>$5.97</w:t>
+            </w:r>
+          </w:p>
+        </w:tc>
+        <w:tc>
+          <w:tcPr>
+            <w:tcW w:w="1435" w:type="dxa"/>
+          </w:tcPr>
+          <w:p>
+            <w:pPr>
+              <w:jc w:val="center"/>
+            </w:pPr>
+            <w:r>
+              <w:rPr>
+                <w:rFonts w:cs="Arial"/>
+                <w:color w:val="000000"/>
+              </w:rPr>
+              <w:t>$11.94</w:t>
+            </w:r>
+          </w:p>
+        </w:tc>
+      </w:tr>
+      <w:tr>
+        <w:tc>
+          <w:tcPr>
+            <w:tcW w:w="5125" w:type="dxa"/>
+          </w:tcPr>
+          <w:p>
+            <w:pPr>
+              <w:jc w:val="center"/>
+            </w:pPr>
+            <w:r>
+              <w:rPr>
+                <w:rFonts w:cs="Arial"/>
+                <w:color w:val="000000"/>
+              </w:rPr>
+              <w:t>10-foot piece of ¾ inch Schedule 40 PVC Tube</w:t>
+            </w:r>
+          </w:p>
+        </w:tc>
+        <w:tc>
+          <w:tcPr>
+            <w:tcW w:w="1440" w:type="dxa"/>
+          </w:tcPr>
+          <w:p>
+            <w:pPr>
+              <w:jc w:val="center"/>
+            </w:pPr>
+            <w:r>
+              <w:rPr>
+                <w:rFonts w:cs="Arial"/>
+                <w:color w:val="000000"/>
+              </w:rPr>
+              <w:t>1</w:t>
+            </w:r>
+          </w:p>
+        </w:tc>
+        <w:tc>
+          <w:tcPr>
+            <w:tcW w:w="1350" w:type="dxa"/>
+          </w:tcPr>
+          <w:p>
+            <w:pPr>
+              <w:jc w:val="center"/>
+            </w:pPr>
+            <w:r>
+              <w:rPr>
+                <w:rFonts w:cs="Arial"/>
+                <w:color w:val="000000"/>
+              </w:rPr>
+              <w:t>$4.86</w:t>
+            </w:r>
+          </w:p>
+        </w:tc>
+        <w:tc>
+          <w:tcPr>
+            <w:tcW w:w="1435" w:type="dxa"/>
+          </w:tcPr>
+          <w:p>
+            <w:pPr>
+              <w:jc w:val="center"/>
+            </w:pPr>
+            <w:r>
+              <w:rPr>
+                <w:rFonts w:cs="Arial"/>
+                <w:color w:val="000000"/>
+              </w:rPr>
+              <w:t>$4.86</w:t>
+            </w:r>
+          </w:p>
+        </w:tc>
+      </w:tr>
+      <w:tr>
+        <w:tc>
+          <w:tcPr>
+            <w:tcW w:w="5125" w:type="dxa"/>
+          </w:tcPr>
+          <w:p>
+            <w:pPr>
+              <w:jc w:val="center"/>
+            </w:pPr>
+            <w:r>
+              <w:rPr>
+                <w:rFonts w:cs="Arial"/>
+                <w:color w:val="000000"/>
+              </w:rPr>
+              <w:t>¾ inch PVC Cross Connectors</w:t>
+            </w:r>
+          </w:p>
+        </w:tc>
+        <w:tc>
+          <w:tcPr>
+            <w:tcW w:w="1440" w:type="dxa"/>
+          </w:tcPr>
+          <w:p>
+            <w:pPr>
+              <w:jc w:val="center"/>
+            </w:pPr>
+            <w:r>
+              <w:rPr>
+                <w:rFonts w:cs="Arial"/>
+                <w:color w:val="000000"/>
+              </w:rPr>
+              <w:t>2</w:t>
+            </w:r>
+          </w:p>
+        </w:tc>
+        <w:tc>
+          <w:tcPr>
+            <w:tcW w:w="1350" w:type="dxa"/>
+          </w:tcPr>
+          <w:p>
+            <w:pPr>
+              <w:jc w:val="center"/>
+            </w:pPr>
+            <w:r>
+              <w:rPr>
+                <w:rFonts w:cs="Arial"/>
+                <w:color w:val="000000"/>
+              </w:rPr>
+              <w:t>$5.21</w:t>
+            </w:r>
+          </w:p>
+        </w:tc>
+        <w:tc>
+          <w:tcPr>
+            <w:tcW w:w="1435" w:type="dxa"/>
+          </w:tcPr>
+          <w:p>
+            <w:pPr>
+              <w:jc w:val="center"/>
+            </w:pPr>
+            <w:r>
+              <w:rPr>
+                <w:rFonts w:cs="Arial"/>
+                <w:color w:val="000000"/>
+              </w:rPr>
+              <w:t>$10.42</w:t>
+            </w:r>
+          </w:p>
+        </w:tc>
+      </w:tr>
+      <w:tr>
+        <w:tc>
+          <w:tcPr>
+            <w:tcW w:w="5125" w:type="dxa"/>
+          </w:tcPr>
+          <w:p>
+            <w:pPr>
+              <w:jc w:val="center"/>
+            </w:pPr>
+            <w:r>
+              <w:rPr>
+                <w:rFonts w:cs="Arial"/>
+                <w:color w:val="000000"/>
+              </w:rPr>
+              <w:t>¾ inch PVC T connector</w:t>
+            </w:r>
+          </w:p>
+        </w:tc>
+        <w:tc>
+          <w:tcPr>
+            <w:tcW w:w="1440" w:type="dxa"/>
+          </w:tcPr>
+          <w:p>
+            <w:pPr>
+              <w:jc w:val="center"/>
+            </w:pPr>
+            <w:r>
+              <w:rPr>
+                <w:rFonts w:cs="Arial"/>
+                <w:color w:val="000000"/>
+              </w:rPr>
+              <w:t>2</w:t>
+            </w:r>
+          </w:p>
+        </w:tc>
+        <w:tc>
+          <w:tcPr>
+            <w:tcW w:w="1350" w:type="dxa"/>
+          </w:tcPr>
+          <w:p>
+            <w:pPr>
+              <w:jc w:val="center"/>
+            </w:pPr>
+            <w:r>
+              <w:rPr>
+                <w:rFonts w:cs="Arial"/>
+                <w:color w:val="000000"/>
+              </w:rPr>
+              <w:t>$1.72</w:t>
+            </w:r>
+          </w:p>
+        </w:tc>
+        <w:tc>
+          <w:tcPr>
+            <w:tcW w:w="1435" w:type="dxa"/>
+          </w:tcPr>
+          <w:p>
+            <w:pPr>
+              <w:jc w:val="center"/>
+            </w:pPr>
+            <w:r>
+              <w:rPr>
+                <w:rFonts w:cs="Arial"/>
+                <w:color w:val="000000"/>
+              </w:rPr>
+              <w:t>$0.86</w:t>
+            </w:r>
+          </w:p>
+        </w:tc>
+      </w:tr>
+      <w:tr>
+        <w:tc>
+          <w:tcPr>
+            <w:tcW w:w="5125" w:type="dxa"/>
+          </w:tcPr>
+          <w:p>
+            <w:pPr>
+              <w:jc w:val="center"/>
+            </w:pPr>
+            <w:r>
+              <w:rPr>
+                <w:rFonts w:cs="Arial"/>
+                <w:color w:val="000000"/>
+              </w:rPr>
+              <w:t>Emery Cloth Sandpaper (3 pack)</w:t>
+            </w:r>
+          </w:p>
+        </w:tc>
+        <w:tc>
+          <w:tcPr>
+            <w:tcW w:w="1440" w:type="dxa"/>
+          </w:tcPr>
+          <w:p>
+            <w:pPr>
+              <w:jc w:val="center"/>
+            </w:pPr>
+            <w:r>
+              <w:rPr>
+                <w:rFonts w:cs="Arial"/>
+                <w:color w:val="000000"/>
+              </w:rPr>
+              <w:t>1</w:t>
+            </w:r>
+          </w:p>
+        </w:tc>
+        <w:tc>
+          <w:tcPr>
+            <w:tcW w:w="1350" w:type="dxa"/>
+          </w:tcPr>
+          <w:p>
+            <w:pPr>
+              <w:jc w:val="center"/>
+            </w:pPr>
+            <w:r>
+              <w:rPr>
+                <w:rFonts w:cs="Arial"/>
+                <w:color w:val="000000"/>
+              </w:rPr>
+              <w:t>$5.98</w:t>
+            </w:r>
+          </w:p>
+        </w:tc>
+        <w:tc>
+          <w:tcPr>
+            <w:tcW w:w="1435" w:type="dxa"/>
+          </w:tcPr>
+          <w:p>
+            <w:pPr>
+              <w:jc w:val="center"/>
+            </w:pPr>
+            <w:r>
+              <w:rPr>
+                <w:rFonts w:cs="Arial"/>
+                <w:color w:val="000000"/>
+              </w:rPr>
+              <w:t>$5.98</w:t>
+            </w:r>
+          </w:p>
+        </w:tc>
+      </w:tr>
+    </w:tbl>
+    <w:p/>
+    <w:p>
+      <w:pPr>
+        <w:jc w:val="center"/>
+      </w:pPr>
+      <w:r>
+        <w:t>PVC pipe</w:t>
+      </w:r>
+      <w:r>
+        <w:t>s</w:t>
+      </w:r>
+      <w:r>
+        <w:t xml:space="preserve"> were measured and cut to create the spacing between elements. A final PVC length was added to the reflector side as the handle for the antenna. The dipole’s tape measure was cut in half with the end sanded to show the conductive material, making soldering easier. The dipole was then connected to the middle PVC junction with stainless hose clamps. The other two elements were cut to their appropriate lengths and secured to their respective junction point using more stainless hose clamps. Electrical tape was added to the ends of all tape measure lengths for safety. For soldering, two copper wires were soldered onto a BNC connector. These were then soldered to the conductive ends of each </w:t>
+      </w:r>
+      <w:r>
+        <w:t>half of the split dipole</w:t>
+      </w:r>
+      <w:r>
+        <w:t xml:space="preserve">. This would create the driven element of the antenna. Below is a </w:t>
+      </w:r>
+      <w:r>
+        <w:t>cinematic shot of a team member utilizing the antenna.</w:t>
+      </w:r>
+    </w:p>
+    <w:p>
+      <w:pPr>
+        <w:jc w:val="center"/>
+      </w:pPr>
+      <w:r>
+        <w:t>[picture antenna-cinematic]</w:t>
+      </w:r>
+    </w:p>
+    <w:p>
+      <w:pPr>
+        <w:jc w:val="center"/>
+      </w:pPr>
+      <w:r>
+        <w:t>Subtitle “</w:t>
+      </w:r>
+      <w:r>
+        <w:t>Testing &amp; Conclusion</w:t>
+      </w:r>
+      <w:r>
+        <w:t>”</w:t>
+      </w:r>
+    </w:p>
+    <w:p>
+      <w:pPr>
+        <w:jc w:val="center"/>
+      </w:pPr>
+      <w:r>
+        <w:lastRenderedPageBreak/>
+        <w:t>Upon testing, the antenna exhibited an impedance value of 57.56 ohms and an induct</w:t>
+      </w:r>
+      <w:r>
+        <w:t xml:space="preserve">ance </w:t>
+      </w:r>
+      <w:r>
+        <w:t xml:space="preserve">of 17.89 </w:t>
+      </w:r>
+      <w:proofErr w:type="spellStart"/>
+      <w:r>
+        <w:t>nH</w:t>
+      </w:r>
+      <w:proofErr w:type="spellEnd"/>
+      <w:r>
+        <w:t xml:space="preserve">. This is a realistic deviation from theory, with 50 ohms being an ideal match for resonance (max power transfer). Below is the SWR curve of our antenna shown via </w:t>
+      </w:r>
+      <w:proofErr w:type="spellStart"/>
+      <w:r>
+        <w:t>NanoVNA</w:t>
+      </w:r>
+      <w:proofErr w:type="spellEnd"/>
+      <w:r>
+        <w:t xml:space="preserve">. We had a VSWR of 1.879 at 95.1 MHz, which is far higher than the simulated 1.16 due to mismatches/reflections. </w:t>
+      </w:r>
+    </w:p>
+    <w:p>
+      <w:pPr>
+        <w:jc w:val="center"/>
+      </w:pPr>
+      <w:r>
+        <w:t xml:space="preserve">[picture </w:t>
+      </w:r>
+      <w:proofErr w:type="spellStart"/>
+      <w:r>
+        <w:t>swr</w:t>
+      </w:r>
+      <w:proofErr w:type="spellEnd"/>
+      <w:r>
+        <w:t>-curve-final]</w:t>
+      </w:r>
+    </w:p>
+    <w:p>
+      <w:pPr>
+        <w:jc w:val="center"/>
+      </w:pPr>
+      <w:r>
+        <w:t xml:space="preserve">The fabricated antenna successfully received the 95.1 MHz FM broadcast using an SDR receiver running </w:t>
+      </w:r>
+      <w:proofErr w:type="spellStart"/>
+      <w:r>
+        <w:t>SDRuno</w:t>
+      </w:r>
+      <w:proofErr w:type="spellEnd"/>
+      <w:r>
+        <w:t>. Audio playback confirmed that the antenna functioned as intended despite the measured VSWR exceeding simulated predictions.</w:t>
+      </w:r>
+      <w:r>
+        <w:t xml:space="preserve"> </w:t>
+      </w:r>
+      <w:r>
+        <w:t xml:space="preserve">Namely, Tate McRae’s “It’s ok I’m ok” was heard. Little distortion was audible. Below is one of the captured screenshots from </w:t>
+      </w:r>
+      <w:proofErr w:type="spellStart"/>
+      <w:r>
+        <w:t>SDRuno</w:t>
+      </w:r>
+      <w:proofErr w:type="spellEnd"/>
+      <w:r>
+        <w:t>.</w:t>
+      </w:r>
+    </w:p>
+    <w:p>
+      <w:pPr>
+        <w:jc w:val="center"/>
+      </w:pPr>
+      <w:r>
+        <w:t xml:space="preserve">[picture </w:t>
+      </w:r>
+      <w:proofErr w:type="spellStart"/>
+      <w:r>
+        <w:t>sdr</w:t>
+      </w:r>
+      <w:proofErr w:type="spellEnd"/>
+      <w:r>
+        <w:t>-uno]</w:t>
+      </w:r>
     </w:p>
     <w:sectPr>
       <w:pgSz w:w="12240" w:h="15840"/>
@@ -2850,6 +4229,25 @@
       <w:u w:val="single"/>
     </w:rPr>
   </w:style>
+  <w:style w:type="table" w:styleId="TableGrid">
+    <w:name w:val="Table Grid"/>
+    <w:basedOn w:val="TableNormal"/>
+    <w:uiPriority w:val="39"/>
+    <w:rsid w:val="0065342E"/>
+    <w:pPr>
+      <w:spacing w:after="0" w:line="240" w:lineRule="auto"/>
+    </w:pPr>
+    <w:tblPr>
+      <w:tblBorders>
+        <w:top w:val="single" w:sz="4" w:space="0" w:color="auto"/>
+        <w:left w:val="single" w:sz="4" w:space="0" w:color="auto"/>
+        <w:bottom w:val="single" w:sz="4" w:space="0" w:color="auto"/>
+        <w:right w:val="single" w:sz="4" w:space="0" w:color="auto"/>
+        <w:insideH w:val="single" w:sz="4" w:space="0" w:color="auto"/>
+        <w:insideV w:val="single" w:sz="4" w:space="0" w:color="auto"/>
+      </w:tblBorders>
+    </w:tblPr>
+  </w:style>
 </w:styles>
 </file>
 

</xml_diff>